<commit_message>
fix: repair broken business-plan.docx and fix header text in both plans
business-plan.docx: [Content_Types].xml was missing declarations for
header2/3, footer2/3, and webextensions — causing Word to reject the
file as broken. Fixed by copying NYDF Content_Types and settings.xml.

Both generic and small plans: header2.xml still read "NYDF Business
Plan 2026" — updated to match each document's correct title.

Co-Authored-By: Claude Sonnet 4.6 <noreply@anthropic.com>
</commit_message>
<xml_diff>
--- a/public/docs/business-plan.docx
+++ b/public/docs/business-plan.docx
@@ -315,7 +315,7 @@
         <w:sz w:val="14"/>
         <w:szCs w:val="14"/>
       </w:rPr>
-      <w:t>Swift Designz Investments CC  |  NYDF Business Plan 2026</w:t>
+      <w:t>Swift Designz Investments CC  |  Business Plan for Funding</w:t>
     </w:r>
   </w:p>
 </w:hdr>
@@ -2070,7 +2070,7 @@
 <file path=word\settings.xml><?xml version="1.0" encoding="utf-8"?>
 <w:settings xmlns:mc="http://schemas.openxmlformats.org/markup-compatibility/2006" xmlns:o="urn:schemas-microsoft-com:office:office" xmlns:r="http://schemas.openxmlformats.org/officeDocument/2006/relationships" xmlns:m="http://schemas.openxmlformats.org/officeDocument/2006/math" xmlns:v="urn:schemas-microsoft-com:vml" xmlns:w10="urn:schemas-microsoft-com:office:word" xmlns:w="http://schemas.openxmlformats.org/wordprocessingml/2006/main" xmlns:w14="http://schemas.microsoft.com/office/word/2010/wordml" xmlns:w15="http://schemas.microsoft.com/office/word/2012/wordml" xmlns:w16cex="http://schemas.microsoft.com/office/word/2018/wordml/cex" xmlns:w16cid="http://schemas.microsoft.com/office/word/2016/wordml/cid" xmlns:w16="http://schemas.microsoft.com/office/word/2018/wordml" xmlns:w16du="http://schemas.microsoft.com/office/word/2023/wordml/word16du" xmlns:w16sdtdh="http://schemas.microsoft.com/office/word/2020/wordml/sdtdatahash" xmlns:w16sdtfl="http://schemas.microsoft.com/office/word/2024/wordml/sdtformatlock" xmlns:w16se="http://schemas.microsoft.com/office/word/2015/wordml/symex" xmlns:sl="http://schemas.openxmlformats.org/schemaLibrary/2006/main" mc:Ignorable="w14 w15 w16se w16cid w16 w16cex w16sdtdh w16sdtfl w16du">
   <w:zoom w:percent="120"/>
-  <w:proofState w:spelling="clean" w:grammar="clean"/>
+  <w:displayBackgroundShape/>
   <w:defaultTabStop w:val="720"/>
   <w:characterSpacingControl w:val="doNotCompress"/>
   <w:footnotePr>
@@ -2090,23 +2090,89 @@
     <w:compatSetting w:name="useWord2013TrackBottomHyphenation" w:uri="http://schemas.microsoft.com/office/word" w:val="1"/>
   </w:compat>
   <w:rsids>
-    <w:rsidRoot w:val="001E3990"/>
-    <w:rsid w:val="00015E63"/>
-    <w:rsid w:val="000E28B4"/>
-    <w:rsid w:val="00173A35"/>
-    <w:rsid w:val="001E3990"/>
-    <w:rsid w:val="00207C57"/>
-    <w:rsid w:val="00225B97"/>
-    <w:rsid w:val="004A5200"/>
-    <w:rsid w:val="00632642"/>
-    <w:rsid w:val="006569A2"/>
-    <w:rsid w:val="00864B86"/>
-    <w:rsid w:val="00941152"/>
-    <w:rsid w:val="00AC37EB"/>
-    <w:rsid w:val="00C92693"/>
-    <w:rsid w:val="00CB0D92"/>
-    <w:rsid w:val="00DA008F"/>
-    <w:rsid w:val="00E0611C"/>
+    <w:rsidRoot w:val="00C63FEC"/>
+    <w:rsid w:val="00002F0A"/>
+    <w:rsid w:val="0007721E"/>
+    <w:rsid w:val="000C3FBC"/>
+    <w:rsid w:val="000F7B87"/>
+    <w:rsid w:val="00101D46"/>
+    <w:rsid w:val="001128A3"/>
+    <w:rsid w:val="001136C8"/>
+    <w:rsid w:val="0012737A"/>
+    <w:rsid w:val="00197A14"/>
+    <w:rsid w:val="001C041D"/>
+    <w:rsid w:val="001C2E2D"/>
+    <w:rsid w:val="001C3137"/>
+    <w:rsid w:val="001E38E4"/>
+    <w:rsid w:val="0025172A"/>
+    <w:rsid w:val="00276CB2"/>
+    <w:rsid w:val="002A3FFB"/>
+    <w:rsid w:val="002B047A"/>
+    <w:rsid w:val="002B098C"/>
+    <w:rsid w:val="002B54DA"/>
+    <w:rsid w:val="003928AC"/>
+    <w:rsid w:val="003E4AF1"/>
+    <w:rsid w:val="00426D1C"/>
+    <w:rsid w:val="004701A8"/>
+    <w:rsid w:val="0048427D"/>
+    <w:rsid w:val="004B37BE"/>
+    <w:rsid w:val="004E522A"/>
+    <w:rsid w:val="004F3760"/>
+    <w:rsid w:val="00507A4C"/>
+    <w:rsid w:val="00524EF2"/>
+    <w:rsid w:val="00524FD5"/>
+    <w:rsid w:val="0053222F"/>
+    <w:rsid w:val="005375A0"/>
+    <w:rsid w:val="00542418"/>
+    <w:rsid w:val="005476C7"/>
+    <w:rsid w:val="00572EAB"/>
+    <w:rsid w:val="00583941"/>
+    <w:rsid w:val="00590D28"/>
+    <w:rsid w:val="006D1B22"/>
+    <w:rsid w:val="006D72DD"/>
+    <w:rsid w:val="00707515"/>
+    <w:rsid w:val="0078225D"/>
+    <w:rsid w:val="00791B4D"/>
+    <w:rsid w:val="00847805"/>
+    <w:rsid w:val="00851B77"/>
+    <w:rsid w:val="00873D13"/>
+    <w:rsid w:val="008A08E2"/>
+    <w:rsid w:val="008B363B"/>
+    <w:rsid w:val="009220C5"/>
+    <w:rsid w:val="009343CF"/>
+    <w:rsid w:val="00953006"/>
+    <w:rsid w:val="009A2BF2"/>
+    <w:rsid w:val="009B5DB2"/>
+    <w:rsid w:val="00A314A7"/>
+    <w:rsid w:val="00A862FD"/>
+    <w:rsid w:val="00AD0D62"/>
+    <w:rsid w:val="00B16B66"/>
+    <w:rsid w:val="00B77CFA"/>
+    <w:rsid w:val="00B901B7"/>
+    <w:rsid w:val="00B90606"/>
+    <w:rsid w:val="00BA1E68"/>
+    <w:rsid w:val="00BB30C0"/>
+    <w:rsid w:val="00BC02B1"/>
+    <w:rsid w:val="00BD2405"/>
+    <w:rsid w:val="00BD2AAD"/>
+    <w:rsid w:val="00C63FEC"/>
+    <w:rsid w:val="00CC644F"/>
+    <w:rsid w:val="00CF498E"/>
+    <w:rsid w:val="00D732DE"/>
+    <w:rsid w:val="00DC616A"/>
+    <w:rsid w:val="00E30149"/>
+    <w:rsid w:val="00E343CF"/>
+    <w:rsid w:val="00E85E15"/>
+    <w:rsid w:val="00E87640"/>
+    <w:rsid w:val="00EC52E1"/>
+    <w:rsid w:val="00EE60CD"/>
+    <w:rsid w:val="00F04A7F"/>
+    <w:rsid w:val="00F112FE"/>
+    <w:rsid w:val="00F656AB"/>
+    <w:rsid w:val="00F938C0"/>
+    <w:rsid w:val="00FA01B9"/>
+    <w:rsid w:val="00FB7FD3"/>
+    <w:rsid w:val="00FF3720"/>
   </w:rsids>
   <m:mathPr>
     <m:mathFont m:val="Cambria Math"/>
@@ -2131,8 +2197,8 @@
   </w:shapeDefaults>
   <w:decimalSymbol w:val="."/>
   <w:listSeparator w:val=","/>
-  <w14:docId w14:val="0BC57C45"/>
-  <w15:docId w15:val="{E76CDE87-757B-4098-A974-3C4AEA4C2B0A}"/>
+  <w14:docId w14:val="62BB77C2"/>
+  <w15:docId w15:val="{7CE0A31E-07C8-4A6D-9F8A-613535CE1383}"/>
 </w:settings>
 </file>
 

</xml_diff>

<commit_message>
fix: rebuild business-plan.docx with clean package structure
Restore original small plan styles, numbering, rels, Content_Types,
and settings — eliminating the table property errors caused by NYDF
style IDs being applied to the small plan body tables. NYDF branding
is kept by injecting its header/footer content into the original rId9
and rId10 slots that the sectPr already references correctly.

Co-Authored-By: Claude Sonnet 4.6 <noreply@anthropic.com>
</commit_message>
<xml_diff>
--- a/public/docs/business-plan.docx
+++ b/public/docs/business-plan.docx
@@ -11202,16 +11202,6 @@
 <w:ftr xmlns:wpc="http://schemas.microsoft.com/office/word/2010/wordprocessingCanvas" xmlns:cx="http://schemas.microsoft.com/office/drawing/2014/chartex" xmlns:cx1="http://schemas.microsoft.com/office/drawing/2015/9/8/chartex" xmlns:cx2="http://schemas.microsoft.com/office/drawing/2015/10/21/chartex" xmlns:cx3="http://schemas.microsoft.com/office/drawing/2016/5/9/chartex" xmlns:cx4="http://schemas.microsoft.com/office/drawing/2016/5/10/chartex" xmlns:cx5="http://schemas.microsoft.com/office/drawing/2016/5/11/chartex" xmlns:cx6="http://schemas.microsoft.com/office/drawing/2016/5/12/chartex" xmlns:cx7="http://schemas.microsoft.com/office/drawing/2016/5/13/chartex" xmlns:cx8="http://schemas.microsoft.com/office/drawing/2016/5/14/chartex" xmlns:mc="http://schemas.openxmlformats.org/markup-compatibility/2006" xmlns:aink="http://schemas.microsoft.com/office/drawing/2016/ink" xmlns:am3d="http://schemas.microsoft.com/office/drawing/2017/model3d" xmlns:o="urn:schemas-microsoft-com:office:office" xmlns:oel="http://schemas.microsoft.com/office/2019/extlst" xmlns:r="http://schemas.openxmlformats.org/officeDocument/2006/relationships" xmlns:m="http://schemas.openxmlformats.org/officeDocument/2006/math" xmlns:v="urn:schemas-microsoft-com:vml" xmlns:wp14="http://schemas.microsoft.com/office/word/2010/wordprocessingDrawing" xmlns:wp="http://schemas.openxmlformats.org/drawingml/2006/wordprocessingDrawing" xmlns:w10="urn:schemas-microsoft-com:office:word" xmlns:w="http://schemas.openxmlformats.org/wordprocessingml/2006/main" xmlns:w14="http://schemas.microsoft.com/office/word/2010/wordml" xmlns:w15="http://schemas.microsoft.com/office/word/2012/wordml" xmlns:w16cex="http://schemas.microsoft.com/office/word/2018/wordml/cex" xmlns:w16cid="http://schemas.microsoft.com/office/word/2016/wordml/cid" xmlns:w16="http://schemas.microsoft.com/office/word/2018/wordml" xmlns:w16du="http://schemas.microsoft.com/office/word/2023/wordml/word16du" xmlns:w16sdtdh="http://schemas.microsoft.com/office/word/2020/wordml/sdtdatahash" xmlns:w16sdtfl="http://schemas.microsoft.com/office/word/2024/wordml/sdtformatlock" xmlns:w16se="http://schemas.microsoft.com/office/word/2015/wordml/symex" xmlns:wpg="http://schemas.microsoft.com/office/word/2010/wordprocessingGroup" xmlns:wpi="http://schemas.microsoft.com/office/word/2010/wordprocessingInk" xmlns:wne="http://schemas.microsoft.com/office/word/2006/wordml" xmlns:wps="http://schemas.microsoft.com/office/word/2010/wordprocessingShape" mc:Ignorable="w14 w15 w16se w16cid w16 w16cex w16sdtdh w16sdtfl w16du wp14">
   <w:p>
     <w:pPr>
-      <w:pStyle w:val="Footer"/>
-    </w:pPr>
-  </w:p>
-</w:ftr>
-</file>
-
-<file path=word\footer2.xml><?xml version="1.0" encoding="utf-8"?>
-<w:ftr xmlns:wpc="http://schemas.microsoft.com/office/word/2010/wordprocessingCanvas" xmlns:cx="http://schemas.microsoft.com/office/drawing/2014/chartex" xmlns:cx1="http://schemas.microsoft.com/office/drawing/2015/9/8/chartex" xmlns:cx2="http://schemas.microsoft.com/office/drawing/2015/10/21/chartex" xmlns:cx3="http://schemas.microsoft.com/office/drawing/2016/5/9/chartex" xmlns:cx4="http://schemas.microsoft.com/office/drawing/2016/5/10/chartex" xmlns:cx5="http://schemas.microsoft.com/office/drawing/2016/5/11/chartex" xmlns:cx6="http://schemas.microsoft.com/office/drawing/2016/5/12/chartex" xmlns:cx7="http://schemas.microsoft.com/office/drawing/2016/5/13/chartex" xmlns:cx8="http://schemas.microsoft.com/office/drawing/2016/5/14/chartex" xmlns:mc="http://schemas.openxmlformats.org/markup-compatibility/2006" xmlns:aink="http://schemas.microsoft.com/office/drawing/2016/ink" xmlns:am3d="http://schemas.microsoft.com/office/drawing/2017/model3d" xmlns:o="urn:schemas-microsoft-com:office:office" xmlns:oel="http://schemas.microsoft.com/office/2019/extlst" xmlns:r="http://schemas.openxmlformats.org/officeDocument/2006/relationships" xmlns:m="http://schemas.openxmlformats.org/officeDocument/2006/math" xmlns:v="urn:schemas-microsoft-com:vml" xmlns:wp14="http://schemas.microsoft.com/office/word/2010/wordprocessingDrawing" xmlns:wp="http://schemas.openxmlformats.org/drawingml/2006/wordprocessingDrawing" xmlns:w10="urn:schemas-microsoft-com:office:word" xmlns:w="http://schemas.openxmlformats.org/wordprocessingml/2006/main" xmlns:w14="http://schemas.microsoft.com/office/word/2010/wordml" xmlns:w15="http://schemas.microsoft.com/office/word/2012/wordml" xmlns:w16cex="http://schemas.microsoft.com/office/word/2018/wordml/cex" xmlns:w16cid="http://schemas.microsoft.com/office/word/2016/wordml/cid" xmlns:w16="http://schemas.microsoft.com/office/word/2018/wordml" xmlns:w16du="http://schemas.microsoft.com/office/word/2023/wordml/word16du" xmlns:w16sdtdh="http://schemas.microsoft.com/office/word/2020/wordml/sdtdatahash" xmlns:w16sdtfl="http://schemas.microsoft.com/office/word/2024/wordml/sdtformatlock" xmlns:w16se="http://schemas.microsoft.com/office/word/2015/wordml/symex" xmlns:wpg="http://schemas.microsoft.com/office/word/2010/wordprocessingGroup" xmlns:wpi="http://schemas.microsoft.com/office/word/2010/wordprocessingInk" xmlns:wne="http://schemas.microsoft.com/office/word/2006/wordml" xmlns:wps="http://schemas.microsoft.com/office/word/2010/wordprocessingShape" mc:Ignorable="w14 w15 w16se w16cid w16 w16cex w16sdtdh w16sdtfl w16du wp14">
-  <w:p>
-    <w:pPr>
       <w:pBdr>
         <w:top w:val="single" w:sz="2" w:space="4" w:color="CCCCCC"/>
       </w:pBdr>
@@ -11324,16 +11314,6 @@
 </w:ftr>
 </file>
 
-<file path=word\footer3.xml><?xml version="1.0" encoding="utf-8"?>
-<w:ftr xmlns:wpc="http://schemas.microsoft.com/office/word/2010/wordprocessingCanvas" xmlns:cx="http://schemas.microsoft.com/office/drawing/2014/chartex" xmlns:cx1="http://schemas.microsoft.com/office/drawing/2015/9/8/chartex" xmlns:cx2="http://schemas.microsoft.com/office/drawing/2015/10/21/chartex" xmlns:cx3="http://schemas.microsoft.com/office/drawing/2016/5/9/chartex" xmlns:cx4="http://schemas.microsoft.com/office/drawing/2016/5/10/chartex" xmlns:cx5="http://schemas.microsoft.com/office/drawing/2016/5/11/chartex" xmlns:cx6="http://schemas.microsoft.com/office/drawing/2016/5/12/chartex" xmlns:cx7="http://schemas.microsoft.com/office/drawing/2016/5/13/chartex" xmlns:cx8="http://schemas.microsoft.com/office/drawing/2016/5/14/chartex" xmlns:mc="http://schemas.openxmlformats.org/markup-compatibility/2006" xmlns:aink="http://schemas.microsoft.com/office/drawing/2016/ink" xmlns:am3d="http://schemas.microsoft.com/office/drawing/2017/model3d" xmlns:o="urn:schemas-microsoft-com:office:office" xmlns:oel="http://schemas.microsoft.com/office/2019/extlst" xmlns:r="http://schemas.openxmlformats.org/officeDocument/2006/relationships" xmlns:m="http://schemas.openxmlformats.org/officeDocument/2006/math" xmlns:v="urn:schemas-microsoft-com:vml" xmlns:wp14="http://schemas.microsoft.com/office/word/2010/wordprocessingDrawing" xmlns:wp="http://schemas.openxmlformats.org/drawingml/2006/wordprocessingDrawing" xmlns:w10="urn:schemas-microsoft-com:office:word" xmlns:w="http://schemas.openxmlformats.org/wordprocessingml/2006/main" xmlns:w14="http://schemas.microsoft.com/office/word/2010/wordml" xmlns:w15="http://schemas.microsoft.com/office/word/2012/wordml" xmlns:w16cex="http://schemas.microsoft.com/office/word/2018/wordml/cex" xmlns:w16cid="http://schemas.microsoft.com/office/word/2016/wordml/cid" xmlns:w16="http://schemas.microsoft.com/office/word/2018/wordml" xmlns:w16du="http://schemas.microsoft.com/office/word/2023/wordml/word16du" xmlns:w16sdtdh="http://schemas.microsoft.com/office/word/2020/wordml/sdtdatahash" xmlns:w16sdtfl="http://schemas.microsoft.com/office/word/2024/wordml/sdtformatlock" xmlns:w16se="http://schemas.microsoft.com/office/word/2015/wordml/symex" xmlns:wpg="http://schemas.microsoft.com/office/word/2010/wordprocessingGroup" xmlns:wpi="http://schemas.microsoft.com/office/word/2010/wordprocessingInk" xmlns:wne="http://schemas.microsoft.com/office/word/2006/wordml" xmlns:wps="http://schemas.microsoft.com/office/word/2010/wordprocessingShape" mc:Ignorable="w14 w15 w16se w16cid w16 w16cex w16sdtdh w16sdtfl w16du wp14">
-  <w:p>
-    <w:pPr>
-      <w:pStyle w:val="Footer"/>
-    </w:pPr>
-  </w:p>
-</w:ftr>
-</file>
-
 <file path=word\footnotes.xml><?xml version="1.0" encoding="utf-8"?>
 <w:footnotes xmlns:wpc="http://schemas.microsoft.com/office/word/2010/wordprocessingCanvas" xmlns:cx="http://schemas.microsoft.com/office/drawing/2014/chartex" xmlns:cx1="http://schemas.microsoft.com/office/drawing/2015/9/8/chartex" xmlns:cx2="http://schemas.microsoft.com/office/drawing/2015/10/21/chartex" xmlns:cx3="http://schemas.microsoft.com/office/drawing/2016/5/9/chartex" xmlns:cx4="http://schemas.microsoft.com/office/drawing/2016/5/10/chartex" xmlns:cx5="http://schemas.microsoft.com/office/drawing/2016/5/11/chartex" xmlns:cx6="http://schemas.microsoft.com/office/drawing/2016/5/12/chartex" xmlns:cx7="http://schemas.microsoft.com/office/drawing/2016/5/13/chartex" xmlns:cx8="http://schemas.microsoft.com/office/drawing/2016/5/14/chartex" xmlns:mc="http://schemas.openxmlformats.org/markup-compatibility/2006" xmlns:aink="http://schemas.microsoft.com/office/drawing/2016/ink" xmlns:am3d="http://schemas.microsoft.com/office/drawing/2017/model3d" xmlns:o="urn:schemas-microsoft-com:office:office" xmlns:oel="http://schemas.microsoft.com/office/2019/extlst" xmlns:r="http://schemas.openxmlformats.org/officeDocument/2006/relationships" xmlns:m="http://schemas.openxmlformats.org/officeDocument/2006/math" xmlns:v="urn:schemas-microsoft-com:vml" xmlns:wp14="http://schemas.microsoft.com/office/word/2010/wordprocessingDrawing" xmlns:wp="http://schemas.openxmlformats.org/drawingml/2006/wordprocessingDrawing" xmlns:w10="urn:schemas-microsoft-com:office:word" xmlns:w="http://schemas.openxmlformats.org/wordprocessingml/2006/main" xmlns:w14="http://schemas.microsoft.com/office/word/2010/wordml" xmlns:w15="http://schemas.microsoft.com/office/word/2012/wordml" xmlns:w16cex="http://schemas.microsoft.com/office/word/2018/wordml/cex" xmlns:w16cid="http://schemas.microsoft.com/office/word/2016/wordml/cid" xmlns:w16="http://schemas.microsoft.com/office/word/2018/wordml" xmlns:w16du="http://schemas.microsoft.com/office/word/2023/wordml/word16du" xmlns:w16sdtdh="http://schemas.microsoft.com/office/word/2020/wordml/sdtdatahash" xmlns:w16sdtfl="http://schemas.microsoft.com/office/word/2024/wordml/sdtformatlock" xmlns:w16se="http://schemas.microsoft.com/office/word/2015/wordml/symex" xmlns:wpg="http://schemas.microsoft.com/office/word/2010/wordprocessingGroup" xmlns:wpi="http://schemas.microsoft.com/office/word/2010/wordprocessingInk" xmlns:wne="http://schemas.microsoft.com/office/word/2006/wordml" xmlns:wps="http://schemas.microsoft.com/office/word/2010/wordprocessingShape" mc:Ignorable="w14 w15 w16se w16cid w16 w16cex w16sdtdh w16sdtfl w16du wp14">
   <w:footnote w:type="separator" w:id="-1">
@@ -11354,16 +11334,6 @@
 </file>
 
 <file path=word\header1.xml><?xml version="1.0" encoding="utf-8"?>
-<w:hdr xmlns:wpc="http://schemas.microsoft.com/office/word/2010/wordprocessingCanvas" xmlns:cx="http://schemas.microsoft.com/office/drawing/2014/chartex" xmlns:cx1="http://schemas.microsoft.com/office/drawing/2015/9/8/chartex" xmlns:cx2="http://schemas.microsoft.com/office/drawing/2015/10/21/chartex" xmlns:cx3="http://schemas.microsoft.com/office/drawing/2016/5/9/chartex" xmlns:cx4="http://schemas.microsoft.com/office/drawing/2016/5/10/chartex" xmlns:cx5="http://schemas.microsoft.com/office/drawing/2016/5/11/chartex" xmlns:cx6="http://schemas.microsoft.com/office/drawing/2016/5/12/chartex" xmlns:cx7="http://schemas.microsoft.com/office/drawing/2016/5/13/chartex" xmlns:cx8="http://schemas.microsoft.com/office/drawing/2016/5/14/chartex" xmlns:mc="http://schemas.openxmlformats.org/markup-compatibility/2006" xmlns:aink="http://schemas.microsoft.com/office/drawing/2016/ink" xmlns:am3d="http://schemas.microsoft.com/office/drawing/2017/model3d" xmlns:o="urn:schemas-microsoft-com:office:office" xmlns:oel="http://schemas.microsoft.com/office/2019/extlst" xmlns:r="http://schemas.openxmlformats.org/officeDocument/2006/relationships" xmlns:m="http://schemas.openxmlformats.org/officeDocument/2006/math" xmlns:v="urn:schemas-microsoft-com:vml" xmlns:wp14="http://schemas.microsoft.com/office/word/2010/wordprocessingDrawing" xmlns:wp="http://schemas.openxmlformats.org/drawingml/2006/wordprocessingDrawing" xmlns:w10="urn:schemas-microsoft-com:office:word" xmlns:w="http://schemas.openxmlformats.org/wordprocessingml/2006/main" xmlns:w14="http://schemas.microsoft.com/office/word/2010/wordml" xmlns:w15="http://schemas.microsoft.com/office/word/2012/wordml" xmlns:w16cex="http://schemas.microsoft.com/office/word/2018/wordml/cex" xmlns:w16cid="http://schemas.microsoft.com/office/word/2016/wordml/cid" xmlns:w16="http://schemas.microsoft.com/office/word/2018/wordml" xmlns:w16du="http://schemas.microsoft.com/office/word/2023/wordml/word16du" xmlns:w16sdtdh="http://schemas.microsoft.com/office/word/2020/wordml/sdtdatahash" xmlns:w16sdtfl="http://schemas.microsoft.com/office/word/2024/wordml/sdtformatlock" xmlns:w16se="http://schemas.microsoft.com/office/word/2015/wordml/symex" xmlns:wpg="http://schemas.microsoft.com/office/word/2010/wordprocessingGroup" xmlns:wpi="http://schemas.microsoft.com/office/word/2010/wordprocessingInk" xmlns:wne="http://schemas.microsoft.com/office/word/2006/wordml" xmlns:wps="http://schemas.microsoft.com/office/word/2010/wordprocessingShape" mc:Ignorable="w14 w15 w16se w16cid w16 w16cex w16sdtdh w16sdtfl w16du wp14">
-  <w:p>
-    <w:pPr>
-      <w:pStyle w:val="Header"/>
-    </w:pPr>
-  </w:p>
-</w:hdr>
-</file>
-
-<file path=word\header2.xml><?xml version="1.0" encoding="utf-8"?>
 <w:hdr xmlns:wpc="http://schemas.microsoft.com/office/word/2010/wordprocessingCanvas" xmlns:cx="http://schemas.microsoft.com/office/drawing/2014/chartex" xmlns:cx1="http://schemas.microsoft.com/office/drawing/2015/9/8/chartex" xmlns:cx2="http://schemas.microsoft.com/office/drawing/2015/10/21/chartex" xmlns:cx3="http://schemas.microsoft.com/office/drawing/2016/5/9/chartex" xmlns:cx4="http://schemas.microsoft.com/office/drawing/2016/5/10/chartex" xmlns:cx5="http://schemas.microsoft.com/office/drawing/2016/5/11/chartex" xmlns:cx6="http://schemas.microsoft.com/office/drawing/2016/5/12/chartex" xmlns:cx7="http://schemas.microsoft.com/office/drawing/2016/5/13/chartex" xmlns:cx8="http://schemas.microsoft.com/office/drawing/2016/5/14/chartex" xmlns:mc="http://schemas.openxmlformats.org/markup-compatibility/2006" xmlns:aink="http://schemas.microsoft.com/office/drawing/2016/ink" xmlns:am3d="http://schemas.microsoft.com/office/drawing/2017/model3d" xmlns:o="urn:schemas-microsoft-com:office:office" xmlns:oel="http://schemas.microsoft.com/office/2019/extlst" xmlns:r="http://schemas.openxmlformats.org/officeDocument/2006/relationships" xmlns:m="http://schemas.openxmlformats.org/officeDocument/2006/math" xmlns:v="urn:schemas-microsoft-com:vml" xmlns:wp14="http://schemas.microsoft.com/office/word/2010/wordprocessingDrawing" xmlns:wp="http://schemas.openxmlformats.org/drawingml/2006/wordprocessingDrawing" xmlns:w10="urn:schemas-microsoft-com:office:word" xmlns:w="http://schemas.openxmlformats.org/wordprocessingml/2006/main" xmlns:w14="http://schemas.microsoft.com/office/word/2010/wordml" xmlns:w15="http://schemas.microsoft.com/office/word/2012/wordml" xmlns:w16cex="http://schemas.microsoft.com/office/word/2018/wordml/cex" xmlns:w16cid="http://schemas.microsoft.com/office/word/2016/wordml/cid" xmlns:w16="http://schemas.microsoft.com/office/word/2018/wordml" xmlns:w16du="http://schemas.microsoft.com/office/word/2023/wordml/word16du" xmlns:w16sdtdh="http://schemas.microsoft.com/office/word/2020/wordml/sdtdatahash" xmlns:w16sdtfl="http://schemas.microsoft.com/office/word/2024/wordml/sdtformatlock" xmlns:w16se="http://schemas.microsoft.com/office/word/2015/wordml/symex" xmlns:wpg="http://schemas.microsoft.com/office/word/2010/wordprocessingGroup" xmlns:wpi="http://schemas.microsoft.com/office/word/2010/wordprocessingInk" xmlns:wne="http://schemas.microsoft.com/office/word/2006/wordml" xmlns:wps="http://schemas.microsoft.com/office/word/2010/wordprocessingShape" mc:Ignorable="w14 w15 w16se w16cid w16 w16cex w16sdtdh w16sdtfl w16du wp14">
   <w:p>
     <w:pPr>
@@ -11387,298 +11357,74 @@
 </w:hdr>
 </file>
 
-<file path=word\header3.xml><?xml version="1.0" encoding="utf-8"?>
-<w:hdr xmlns:wpc="http://schemas.microsoft.com/office/word/2010/wordprocessingCanvas" xmlns:cx="http://schemas.microsoft.com/office/drawing/2014/chartex" xmlns:cx1="http://schemas.microsoft.com/office/drawing/2015/9/8/chartex" xmlns:cx2="http://schemas.microsoft.com/office/drawing/2015/10/21/chartex" xmlns:cx3="http://schemas.microsoft.com/office/drawing/2016/5/9/chartex" xmlns:cx4="http://schemas.microsoft.com/office/drawing/2016/5/10/chartex" xmlns:cx5="http://schemas.microsoft.com/office/drawing/2016/5/11/chartex" xmlns:cx6="http://schemas.microsoft.com/office/drawing/2016/5/12/chartex" xmlns:cx7="http://schemas.microsoft.com/office/drawing/2016/5/13/chartex" xmlns:cx8="http://schemas.microsoft.com/office/drawing/2016/5/14/chartex" xmlns:mc="http://schemas.openxmlformats.org/markup-compatibility/2006" xmlns:aink="http://schemas.microsoft.com/office/drawing/2016/ink" xmlns:am3d="http://schemas.microsoft.com/office/drawing/2017/model3d" xmlns:o="urn:schemas-microsoft-com:office:office" xmlns:oel="http://schemas.microsoft.com/office/2019/extlst" xmlns:r="http://schemas.openxmlformats.org/officeDocument/2006/relationships" xmlns:m="http://schemas.openxmlformats.org/officeDocument/2006/math" xmlns:v="urn:schemas-microsoft-com:vml" xmlns:wp14="http://schemas.microsoft.com/office/word/2010/wordprocessingDrawing" xmlns:wp="http://schemas.openxmlformats.org/drawingml/2006/wordprocessingDrawing" xmlns:w10="urn:schemas-microsoft-com:office:word" xmlns:w="http://schemas.openxmlformats.org/wordprocessingml/2006/main" xmlns:w14="http://schemas.microsoft.com/office/word/2010/wordml" xmlns:w15="http://schemas.microsoft.com/office/word/2012/wordml" xmlns:w16cex="http://schemas.microsoft.com/office/word/2018/wordml/cex" xmlns:w16cid="http://schemas.microsoft.com/office/word/2016/wordml/cid" xmlns:w16="http://schemas.microsoft.com/office/word/2018/wordml" xmlns:w16du="http://schemas.microsoft.com/office/word/2023/wordml/word16du" xmlns:w16sdtdh="http://schemas.microsoft.com/office/word/2020/wordml/sdtdatahash" xmlns:w16sdtfl="http://schemas.microsoft.com/office/word/2024/wordml/sdtformatlock" xmlns:w16se="http://schemas.microsoft.com/office/word/2015/wordml/symex" xmlns:wpg="http://schemas.microsoft.com/office/word/2010/wordprocessingGroup" xmlns:wpi="http://schemas.microsoft.com/office/word/2010/wordprocessingInk" xmlns:wne="http://schemas.microsoft.com/office/word/2006/wordml" xmlns:wps="http://schemas.microsoft.com/office/word/2010/wordprocessingShape" mc:Ignorable="w14 w15 w16se w16cid w16 w16cex w16sdtdh w16sdtfl w16du wp14">
-  <w:p>
-    <w:pPr>
-      <w:pStyle w:val="Header"/>
-    </w:pPr>
-  </w:p>
-</w:hdr>
-</file>
-
 <file path=word\numbering.xml><?xml version="1.0" encoding="utf-8"?>
 <w:numbering xmlns:wpc="http://schemas.microsoft.com/office/word/2010/wordprocessingCanvas" xmlns:cx="http://schemas.microsoft.com/office/drawing/2014/chartex" xmlns:cx1="http://schemas.microsoft.com/office/drawing/2015/9/8/chartex" xmlns:cx2="http://schemas.microsoft.com/office/drawing/2015/10/21/chartex" xmlns:cx3="http://schemas.microsoft.com/office/drawing/2016/5/9/chartex" xmlns:cx4="http://schemas.microsoft.com/office/drawing/2016/5/10/chartex" xmlns:cx5="http://schemas.microsoft.com/office/drawing/2016/5/11/chartex" xmlns:cx6="http://schemas.microsoft.com/office/drawing/2016/5/12/chartex" xmlns:cx7="http://schemas.microsoft.com/office/drawing/2016/5/13/chartex" xmlns:cx8="http://schemas.microsoft.com/office/drawing/2016/5/14/chartex" xmlns:mc="http://schemas.openxmlformats.org/markup-compatibility/2006" xmlns:aink="http://schemas.microsoft.com/office/drawing/2016/ink" xmlns:am3d="http://schemas.microsoft.com/office/drawing/2017/model3d" xmlns:o="urn:schemas-microsoft-com:office:office" xmlns:oel="http://schemas.microsoft.com/office/2019/extlst" xmlns:r="http://schemas.openxmlformats.org/officeDocument/2006/relationships" xmlns:m="http://schemas.openxmlformats.org/officeDocument/2006/math" xmlns:v="urn:schemas-microsoft-com:vml" xmlns:wp14="http://schemas.microsoft.com/office/word/2010/wordprocessingDrawing" xmlns:wp="http://schemas.openxmlformats.org/drawingml/2006/wordprocessingDrawing" xmlns:w10="urn:schemas-microsoft-com:office:word" xmlns:w="http://schemas.openxmlformats.org/wordprocessingml/2006/main" xmlns:w14="http://schemas.microsoft.com/office/word/2010/wordml" xmlns:w15="http://schemas.microsoft.com/office/word/2012/wordml" xmlns:w16cex="http://schemas.microsoft.com/office/word/2018/wordml/cex" xmlns:w16cid="http://schemas.microsoft.com/office/word/2016/wordml/cid" xmlns:w16="http://schemas.microsoft.com/office/word/2018/wordml" xmlns:w16du="http://schemas.microsoft.com/office/word/2023/wordml/word16du" xmlns:w16sdtdh="http://schemas.microsoft.com/office/word/2020/wordml/sdtdatahash" xmlns:w16sdtfl="http://schemas.microsoft.com/office/word/2024/wordml/sdtformatlock" xmlns:w16se="http://schemas.microsoft.com/office/word/2015/wordml/symex" xmlns:wpg="http://schemas.microsoft.com/office/word/2010/wordprocessingGroup" xmlns:wpi="http://schemas.microsoft.com/office/word/2010/wordprocessingInk" xmlns:wne="http://schemas.microsoft.com/office/word/2006/wordml" xmlns:wps="http://schemas.microsoft.com/office/word/2010/wordprocessingShape" mc:Ignorable="w14 w15 w16se w16cid w16 w16cex w16sdtdh w16sdtfl w16du wp14">
   <w:abstractNum w:abstractNumId="0" w15:restartNumberingAfterBreak="0">
-    <w:nsid w:val="FFFFFF88"/>
-    <w:multiLevelType w:val="singleLevel"/>
-    <w:tmpl w:val="92D6A522"/>
-    <w:lvl w:ilvl="0">
+    <w:nsid w:val="002708D7"/>
+    <w:multiLevelType w:val="hybridMultilevel"/>
+    <w:tmpl w:val="AF8ADC38"/>
+    <w:lvl w:ilvl="0" w:tplc="D1BE0CD2">
       <w:start w:val="1"/>
+      <w:numFmt w:val="bullet"/>
+      <w:lvlText w:val="•"/>
+      <w:lvlJc w:val="left"/>
+      <w:pPr>
+        <w:ind w:left="720" w:hanging="360"/>
+      </w:pPr>
+    </w:lvl>
+    <w:lvl w:ilvl="1" w:tplc="3EF25BEE">
       <w:numFmt w:val="decimal"/>
-      <w:pStyle w:val="ListNumber"/>
-      <w:lvlText w:val="%1."/>
+      <w:lvlText w:val=""/>
       <w:lvlJc w:val="left"/>
-      <w:pPr>
-        <w:tabs>
-          <w:tab w:val="num" w:pos="360"/>
-        </w:tabs>
-        <w:ind w:left="360" w:hanging="360"/>
-      </w:pPr>
+    </w:lvl>
+    <w:lvl w:ilvl="2" w:tplc="2168D4E6">
+      <w:numFmt w:val="decimal"/>
+      <w:lvlText w:val=""/>
+      <w:lvlJc w:val="left"/>
+    </w:lvl>
+    <w:lvl w:ilvl="3" w:tplc="07606578">
+      <w:numFmt w:val="decimal"/>
+      <w:lvlText w:val=""/>
+      <w:lvlJc w:val="left"/>
+    </w:lvl>
+    <w:lvl w:ilvl="4" w:tplc="274608D4">
+      <w:numFmt w:val="decimal"/>
+      <w:lvlText w:val=""/>
+      <w:lvlJc w:val="left"/>
+    </w:lvl>
+    <w:lvl w:ilvl="5" w:tplc="2FCABC76">
+      <w:numFmt w:val="decimal"/>
+      <w:lvlText w:val=""/>
+      <w:lvlJc w:val="left"/>
+    </w:lvl>
+    <w:lvl w:ilvl="6" w:tplc="A6C2082A">
+      <w:numFmt w:val="decimal"/>
+      <w:lvlText w:val=""/>
+      <w:lvlJc w:val="left"/>
+    </w:lvl>
+    <w:lvl w:ilvl="7" w:tplc="AAA8A38E">
+      <w:numFmt w:val="decimal"/>
+      <w:lvlText w:val=""/>
+      <w:lvlJc w:val="left"/>
+    </w:lvl>
+    <w:lvl w:ilvl="8" w:tplc="1680A44A">
+      <w:numFmt w:val="decimal"/>
+      <w:lvlText w:val=""/>
+      <w:lvlJc w:val="left"/>
     </w:lvl>
   </w:abstractNum>
   <w:abstractNum w:abstractNumId="1" w15:restartNumberingAfterBreak="0">
-    <w:nsid w:val="FFFFFF89"/>
-    <w:multiLevelType w:val="singleLevel"/>
-    <w:tmpl w:val="04661C3C"/>
-    <w:lvl w:ilvl="0">
+    <w:nsid w:val="0BC00474"/>
+    <w:multiLevelType w:val="hybridMultilevel"/>
+    <w:tmpl w:val="270A1C3A"/>
+    <w:lvl w:ilvl="0" w:tplc="20000013">
       <w:start w:val="1"/>
-      <w:numFmt w:val="bullet"/>
-      <w:pStyle w:val="ListBullet"/>
-      <w:lvlText w:val=""/>
-      <w:lvlJc w:val="left"/>
-      <w:pPr>
-        <w:tabs>
-          <w:tab w:val="num" w:pos="360"/>
-        </w:tabs>
-        <w:ind w:left="360" w:hanging="360"/>
-      </w:pPr>
-      <w:rPr>
-        <w:rFonts w:ascii="Symbol" w:hAnsi="Symbol" w:hint="default"/>
-      </w:rPr>
-    </w:lvl>
-  </w:abstractNum>
-  <w:abstractNum w:abstractNumId="2" w15:restartNumberingAfterBreak="0">
-    <w:nsid w:val="022B642A"/>
-    <w:multiLevelType w:val="hybridMultilevel"/>
-    <w:tmpl w:val="C4C2D65C"/>
-    <w:lvl w:ilvl="0" w:tplc="2000000B">
-      <w:start w:val="1"/>
-      <w:numFmt w:val="bullet"/>
-      <w:lvlText w:val=""/>
-      <w:lvlJc w:val="left"/>
+      <w:numFmt w:val="upperRoman"/>
+      <w:lvlText w:val="%1."/>
+      <w:lvlJc w:val="right"/>
       <w:pPr>
         <w:ind w:left="720" w:hanging="360"/>
       </w:pPr>
-      <w:rPr>
-        <w:rFonts w:ascii="Wingdings" w:hAnsi="Wingdings" w:hint="default"/>
-      </w:rPr>
-    </w:lvl>
-    <w:lvl w:ilvl="1" w:tplc="20000003" w:tentative="1">
-      <w:start w:val="1"/>
-      <w:numFmt w:val="bullet"/>
-      <w:lvlText w:val="o"/>
-      <w:lvlJc w:val="left"/>
-      <w:pPr>
-        <w:ind w:left="1440" w:hanging="360"/>
-      </w:pPr>
-      <w:rPr>
-        <w:rFonts w:ascii="Courier New" w:hAnsi="Courier New" w:cs="Courier New" w:hint="default"/>
-      </w:rPr>
-    </w:lvl>
-    <w:lvl w:ilvl="2" w:tplc="20000005" w:tentative="1">
-      <w:start w:val="1"/>
-      <w:numFmt w:val="bullet"/>
-      <w:lvlText w:val=""/>
-      <w:lvlJc w:val="left"/>
-      <w:pPr>
-        <w:ind w:left="2160" w:hanging="360"/>
-      </w:pPr>
-      <w:rPr>
-        <w:rFonts w:ascii="Wingdings" w:hAnsi="Wingdings" w:hint="default"/>
-      </w:rPr>
-    </w:lvl>
-    <w:lvl w:ilvl="3" w:tplc="20000001" w:tentative="1">
-      <w:start w:val="1"/>
-      <w:numFmt w:val="bullet"/>
-      <w:lvlText w:val=""/>
-      <w:lvlJc w:val="left"/>
-      <w:pPr>
-        <w:ind w:left="2880" w:hanging="360"/>
-      </w:pPr>
-      <w:rPr>
-        <w:rFonts w:ascii="Symbol" w:hAnsi="Symbol" w:hint="default"/>
-      </w:rPr>
-    </w:lvl>
-    <w:lvl w:ilvl="4" w:tplc="20000003" w:tentative="1">
-      <w:start w:val="1"/>
-      <w:numFmt w:val="bullet"/>
-      <w:lvlText w:val="o"/>
-      <w:lvlJc w:val="left"/>
-      <w:pPr>
-        <w:ind w:left="3600" w:hanging="360"/>
-      </w:pPr>
-      <w:rPr>
-        <w:rFonts w:ascii="Courier New" w:hAnsi="Courier New" w:cs="Courier New" w:hint="default"/>
-      </w:rPr>
-    </w:lvl>
-    <w:lvl w:ilvl="5" w:tplc="20000005" w:tentative="1">
-      <w:start w:val="1"/>
-      <w:numFmt w:val="bullet"/>
-      <w:lvlText w:val=""/>
-      <w:lvlJc w:val="left"/>
-      <w:pPr>
-        <w:ind w:left="4320" w:hanging="360"/>
-      </w:pPr>
-      <w:rPr>
-        <w:rFonts w:ascii="Wingdings" w:hAnsi="Wingdings" w:hint="default"/>
-      </w:rPr>
-    </w:lvl>
-    <w:lvl w:ilvl="6" w:tplc="20000001" w:tentative="1">
-      <w:start w:val="1"/>
-      <w:numFmt w:val="bullet"/>
-      <w:lvlText w:val=""/>
-      <w:lvlJc w:val="left"/>
-      <w:pPr>
-        <w:ind w:left="5040" w:hanging="360"/>
-      </w:pPr>
-      <w:rPr>
-        <w:rFonts w:ascii="Symbol" w:hAnsi="Symbol" w:hint="default"/>
-      </w:rPr>
-    </w:lvl>
-    <w:lvl w:ilvl="7" w:tplc="20000003" w:tentative="1">
-      <w:start w:val="1"/>
-      <w:numFmt w:val="bullet"/>
-      <w:lvlText w:val="o"/>
-      <w:lvlJc w:val="left"/>
-      <w:pPr>
-        <w:ind w:left="5760" w:hanging="360"/>
-      </w:pPr>
-      <w:rPr>
-        <w:rFonts w:ascii="Courier New" w:hAnsi="Courier New" w:cs="Courier New" w:hint="default"/>
-      </w:rPr>
-    </w:lvl>
-    <w:lvl w:ilvl="8" w:tplc="20000005" w:tentative="1">
-      <w:start w:val="1"/>
-      <w:numFmt w:val="bullet"/>
-      <w:lvlText w:val=""/>
-      <w:lvlJc w:val="left"/>
-      <w:pPr>
-        <w:ind w:left="6480" w:hanging="360"/>
-      </w:pPr>
-      <w:rPr>
-        <w:rFonts w:ascii="Wingdings" w:hAnsi="Wingdings" w:hint="default"/>
-      </w:rPr>
-    </w:lvl>
-  </w:abstractNum>
-  <w:abstractNum w:abstractNumId="3" w15:restartNumberingAfterBreak="0">
-    <w:nsid w:val="110D5F7E"/>
-    <w:multiLevelType w:val="hybridMultilevel"/>
-    <w:tmpl w:val="4DBC94F4"/>
-    <w:lvl w:ilvl="0" w:tplc="20000001">
-      <w:start w:val="1"/>
-      <w:numFmt w:val="bullet"/>
-      <w:lvlText w:val=""/>
-      <w:lvlJc w:val="left"/>
-      <w:pPr>
-        <w:ind w:left="1260" w:hanging="360"/>
-      </w:pPr>
-      <w:rPr>
-        <w:rFonts w:ascii="Symbol" w:hAnsi="Symbol" w:hint="default"/>
-      </w:rPr>
-    </w:lvl>
-    <w:lvl w:ilvl="1" w:tplc="20000003" w:tentative="1">
-      <w:start w:val="1"/>
-      <w:numFmt w:val="bullet"/>
-      <w:lvlText w:val="o"/>
-      <w:lvlJc w:val="left"/>
-      <w:pPr>
-        <w:ind w:left="1980" w:hanging="360"/>
-      </w:pPr>
-      <w:rPr>
-        <w:rFonts w:ascii="Courier New" w:hAnsi="Courier New" w:cs="Courier New" w:hint="default"/>
-      </w:rPr>
-    </w:lvl>
-    <w:lvl w:ilvl="2" w:tplc="20000005" w:tentative="1">
-      <w:start w:val="1"/>
-      <w:numFmt w:val="bullet"/>
-      <w:lvlText w:val=""/>
-      <w:lvlJc w:val="left"/>
-      <w:pPr>
-        <w:ind w:left="2700" w:hanging="360"/>
-      </w:pPr>
-      <w:rPr>
-        <w:rFonts w:ascii="Wingdings" w:hAnsi="Wingdings" w:hint="default"/>
-      </w:rPr>
-    </w:lvl>
-    <w:lvl w:ilvl="3" w:tplc="20000001" w:tentative="1">
-      <w:start w:val="1"/>
-      <w:numFmt w:val="bullet"/>
-      <w:lvlText w:val=""/>
-      <w:lvlJc w:val="left"/>
-      <w:pPr>
-        <w:ind w:left="3420" w:hanging="360"/>
-      </w:pPr>
-      <w:rPr>
-        <w:rFonts w:ascii="Symbol" w:hAnsi="Symbol" w:hint="default"/>
-      </w:rPr>
-    </w:lvl>
-    <w:lvl w:ilvl="4" w:tplc="20000003" w:tentative="1">
-      <w:start w:val="1"/>
-      <w:numFmt w:val="bullet"/>
-      <w:lvlText w:val="o"/>
-      <w:lvlJc w:val="left"/>
-      <w:pPr>
-        <w:ind w:left="4140" w:hanging="360"/>
-      </w:pPr>
-      <w:rPr>
-        <w:rFonts w:ascii="Courier New" w:hAnsi="Courier New" w:cs="Courier New" w:hint="default"/>
-      </w:rPr>
-    </w:lvl>
-    <w:lvl w:ilvl="5" w:tplc="20000005" w:tentative="1">
-      <w:start w:val="1"/>
-      <w:numFmt w:val="bullet"/>
-      <w:lvlText w:val=""/>
-      <w:lvlJc w:val="left"/>
-      <w:pPr>
-        <w:ind w:left="4860" w:hanging="360"/>
-      </w:pPr>
-      <w:rPr>
-        <w:rFonts w:ascii="Wingdings" w:hAnsi="Wingdings" w:hint="default"/>
-      </w:rPr>
-    </w:lvl>
-    <w:lvl w:ilvl="6" w:tplc="20000001" w:tentative="1">
-      <w:start w:val="1"/>
-      <w:numFmt w:val="bullet"/>
-      <w:lvlText w:val=""/>
-      <w:lvlJc w:val="left"/>
-      <w:pPr>
-        <w:ind w:left="5580" w:hanging="360"/>
-      </w:pPr>
-      <w:rPr>
-        <w:rFonts w:ascii="Symbol" w:hAnsi="Symbol" w:hint="default"/>
-      </w:rPr>
-    </w:lvl>
-    <w:lvl w:ilvl="7" w:tplc="20000003" w:tentative="1">
-      <w:start w:val="1"/>
-      <w:numFmt w:val="bullet"/>
-      <w:lvlText w:val="o"/>
-      <w:lvlJc w:val="left"/>
-      <w:pPr>
-        <w:ind w:left="6300" w:hanging="360"/>
-      </w:pPr>
-      <w:rPr>
-        <w:rFonts w:ascii="Courier New" w:hAnsi="Courier New" w:cs="Courier New" w:hint="default"/>
-      </w:rPr>
-    </w:lvl>
-    <w:lvl w:ilvl="8" w:tplc="20000005" w:tentative="1">
-      <w:start w:val="1"/>
-      <w:numFmt w:val="bullet"/>
-      <w:lvlText w:val=""/>
-      <w:lvlJc w:val="left"/>
-      <w:pPr>
-        <w:ind w:left="7020" w:hanging="360"/>
-      </w:pPr>
-      <w:rPr>
-        <w:rFonts w:ascii="Wingdings" w:hAnsi="Wingdings" w:hint="default"/>
-      </w:rPr>
-    </w:lvl>
-  </w:abstractNum>
-  <w:abstractNum w:abstractNumId="4" w15:restartNumberingAfterBreak="0">
-    <w:nsid w:val="14E66CB2"/>
-    <w:multiLevelType w:val="hybridMultilevel"/>
-    <w:tmpl w:val="D0E8D154"/>
-    <w:lvl w:ilvl="0" w:tplc="2000000B">
-      <w:start w:val="1"/>
-      <w:numFmt w:val="bullet"/>
-      <w:lvlText w:val=""/>
-      <w:lvlJc w:val="left"/>
-      <w:pPr>
-        <w:ind w:left="1080" w:hanging="360"/>
-      </w:pPr>
-      <w:rPr>
-        <w:rFonts w:ascii="Wingdings" w:hAnsi="Wingdings" w:hint="default"/>
-      </w:rPr>
     </w:lvl>
     <w:lvl w:ilvl="1" w:tplc="FFFFFFFF">
       <w:numFmt w:val="decimal"/>
@@ -11721,238 +11467,65 @@
       <w:lvlJc w:val="left"/>
     </w:lvl>
   </w:abstractNum>
-  <w:abstractNum w:abstractNumId="5" w15:restartNumberingAfterBreak="0">
-    <w:nsid w:val="36811EDB"/>
+  <w:abstractNum w:abstractNumId="2" w15:restartNumberingAfterBreak="0">
+    <w:nsid w:val="6FAE3F6C"/>
     <w:multiLevelType w:val="hybridMultilevel"/>
-    <w:tmpl w:val="C9FEACB6"/>
-    <w:lvl w:ilvl="0" w:tplc="2000000B">
+    <w:tmpl w:val="CCB8341A"/>
+    <w:lvl w:ilvl="0" w:tplc="2ADCA7F0">
       <w:start w:val="1"/>
-      <w:numFmt w:val="bullet"/>
-      <w:lvlText w:val=""/>
+      <w:numFmt w:val="decimal"/>
+      <w:lvlText w:val="%1."/>
       <w:lvlJc w:val="left"/>
       <w:pPr>
         <w:ind w:left="720" w:hanging="360"/>
       </w:pPr>
-      <w:rPr>
-        <w:rFonts w:ascii="Wingdings" w:hAnsi="Wingdings" w:hint="default"/>
-      </w:rPr>
     </w:lvl>
-    <w:lvl w:ilvl="1" w:tplc="20000003" w:tentative="1">
-      <w:start w:val="1"/>
-      <w:numFmt w:val="bullet"/>
-      <w:lvlText w:val="o"/>
-      <w:lvlJc w:val="left"/>
-      <w:pPr>
-        <w:ind w:left="1440" w:hanging="360"/>
-      </w:pPr>
-      <w:rPr>
-        <w:rFonts w:ascii="Courier New" w:hAnsi="Courier New" w:cs="Courier New" w:hint="default"/>
-      </w:rPr>
-    </w:lvl>
-    <w:lvl w:ilvl="2" w:tplc="20000005" w:tentative="1">
-      <w:start w:val="1"/>
-      <w:numFmt w:val="bullet"/>
-      <w:lvlText w:val=""/>
-      <w:lvlJc w:val="left"/>
-      <w:pPr>
-        <w:ind w:left="2160" w:hanging="360"/>
-      </w:pPr>
-      <w:rPr>
-        <w:rFonts w:ascii="Wingdings" w:hAnsi="Wingdings" w:hint="default"/>
-      </w:rPr>
-    </w:lvl>
-    <w:lvl w:ilvl="3" w:tplc="20000001" w:tentative="1">
-      <w:start w:val="1"/>
-      <w:numFmt w:val="bullet"/>
-      <w:lvlText w:val=""/>
-      <w:lvlJc w:val="left"/>
-      <w:pPr>
-        <w:ind w:left="2880" w:hanging="360"/>
-      </w:pPr>
-      <w:rPr>
-        <w:rFonts w:ascii="Symbol" w:hAnsi="Symbol" w:hint="default"/>
-      </w:rPr>
-    </w:lvl>
-    <w:lvl w:ilvl="4" w:tplc="20000003" w:tentative="1">
-      <w:start w:val="1"/>
-      <w:numFmt w:val="bullet"/>
-      <w:lvlText w:val="o"/>
-      <w:lvlJc w:val="left"/>
-      <w:pPr>
-        <w:ind w:left="3600" w:hanging="360"/>
-      </w:pPr>
-      <w:rPr>
-        <w:rFonts w:ascii="Courier New" w:hAnsi="Courier New" w:cs="Courier New" w:hint="default"/>
-      </w:rPr>
-    </w:lvl>
-    <w:lvl w:ilvl="5" w:tplc="20000005" w:tentative="1">
-      <w:start w:val="1"/>
-      <w:numFmt w:val="bullet"/>
-      <w:lvlText w:val=""/>
-      <w:lvlJc w:val="left"/>
-      <w:pPr>
-        <w:ind w:left="4320" w:hanging="360"/>
-      </w:pPr>
-      <w:rPr>
-        <w:rFonts w:ascii="Wingdings" w:hAnsi="Wingdings" w:hint="default"/>
-      </w:rPr>
-    </w:lvl>
-    <w:lvl w:ilvl="6" w:tplc="20000001" w:tentative="1">
-      <w:start w:val="1"/>
-      <w:numFmt w:val="bullet"/>
-      <w:lvlText w:val=""/>
-      <w:lvlJc w:val="left"/>
-      <w:pPr>
-        <w:ind w:left="5040" w:hanging="360"/>
-      </w:pPr>
-      <w:rPr>
-        <w:rFonts w:ascii="Symbol" w:hAnsi="Symbol" w:hint="default"/>
-      </w:rPr>
-    </w:lvl>
-    <w:lvl w:ilvl="7" w:tplc="20000003" w:tentative="1">
-      <w:start w:val="1"/>
-      <w:numFmt w:val="bullet"/>
-      <w:lvlText w:val="o"/>
-      <w:lvlJc w:val="left"/>
-      <w:pPr>
-        <w:ind w:left="5760" w:hanging="360"/>
-      </w:pPr>
-      <w:rPr>
-        <w:rFonts w:ascii="Courier New" w:hAnsi="Courier New" w:cs="Courier New" w:hint="default"/>
-      </w:rPr>
-    </w:lvl>
-    <w:lvl w:ilvl="8" w:tplc="20000005" w:tentative="1">
-      <w:start w:val="1"/>
-      <w:numFmt w:val="bullet"/>
-      <w:lvlText w:val=""/>
-      <w:lvlJc w:val="left"/>
-      <w:pPr>
-        <w:ind w:left="6480" w:hanging="360"/>
-      </w:pPr>
-      <w:rPr>
-        <w:rFonts w:ascii="Wingdings" w:hAnsi="Wingdings" w:hint="default"/>
-      </w:rPr>
-    </w:lvl>
-  </w:abstractNum>
-  <w:abstractNum w:abstractNumId="6" w15:restartNumberingAfterBreak="0">
-    <w:nsid w:val="4A0B5103"/>
-    <w:multiLevelType w:val="hybridMultilevel"/>
-    <w:tmpl w:val="F98C145A"/>
-    <w:lvl w:ilvl="0" w:tplc="2000000B">
-      <w:start w:val="1"/>
-      <w:numFmt w:val="bullet"/>
-      <w:lvlText w:val=""/>
-      <w:lvlJc w:val="left"/>
-      <w:pPr>
-        <w:ind w:left="900" w:hanging="360"/>
-      </w:pPr>
-      <w:rPr>
-        <w:rFonts w:ascii="Wingdings" w:hAnsi="Wingdings" w:hint="default"/>
-      </w:rPr>
-    </w:lvl>
-    <w:lvl w:ilvl="1" w:tplc="FFFFFFFF">
+    <w:lvl w:ilvl="1" w:tplc="4686F6E2">
       <w:numFmt w:val="decimal"/>
       <w:lvlText w:val=""/>
       <w:lvlJc w:val="left"/>
     </w:lvl>
-    <w:lvl w:ilvl="2" w:tplc="FFFFFFFF">
+    <w:lvl w:ilvl="2" w:tplc="CC1A8676">
       <w:numFmt w:val="decimal"/>
       <w:lvlText w:val=""/>
       <w:lvlJc w:val="left"/>
     </w:lvl>
-    <w:lvl w:ilvl="3" w:tplc="FFFFFFFF">
+    <w:lvl w:ilvl="3" w:tplc="F77258E6">
       <w:numFmt w:val="decimal"/>
       <w:lvlText w:val=""/>
       <w:lvlJc w:val="left"/>
     </w:lvl>
-    <w:lvl w:ilvl="4" w:tplc="FFFFFFFF">
+    <w:lvl w:ilvl="4" w:tplc="C12E8DFC">
       <w:numFmt w:val="decimal"/>
       <w:lvlText w:val=""/>
       <w:lvlJc w:val="left"/>
     </w:lvl>
-    <w:lvl w:ilvl="5" w:tplc="FFFFFFFF">
+    <w:lvl w:ilvl="5" w:tplc="91FE2288">
       <w:numFmt w:val="decimal"/>
       <w:lvlText w:val=""/>
       <w:lvlJc w:val="left"/>
     </w:lvl>
-    <w:lvl w:ilvl="6" w:tplc="FFFFFFFF">
+    <w:lvl w:ilvl="6" w:tplc="1844329E">
       <w:numFmt w:val="decimal"/>
       <w:lvlText w:val=""/>
       <w:lvlJc w:val="left"/>
     </w:lvl>
-    <w:lvl w:ilvl="7" w:tplc="FFFFFFFF">
+    <w:lvl w:ilvl="7" w:tplc="2104ED20">
       <w:numFmt w:val="decimal"/>
       <w:lvlText w:val=""/>
       <w:lvlJc w:val="left"/>
     </w:lvl>
-    <w:lvl w:ilvl="8" w:tplc="FFFFFFFF">
+    <w:lvl w:ilvl="8" w:tplc="A82C19B6">
       <w:numFmt w:val="decimal"/>
       <w:lvlText w:val=""/>
       <w:lvlJc w:val="left"/>
     </w:lvl>
   </w:abstractNum>
-  <w:abstractNum w:abstractNumId="7" w15:restartNumberingAfterBreak="0">
-    <w:nsid w:val="4CC14028"/>
+  <w:abstractNum w:abstractNumId="3" w15:restartNumberingAfterBreak="0">
+    <w:nsid w:val="71300641"/>
     <w:multiLevelType w:val="hybridMultilevel"/>
-    <w:tmpl w:val="C3D4544E"/>
-    <w:lvl w:ilvl="0" w:tplc="2000000D">
-      <w:start w:val="1"/>
-      <w:numFmt w:val="bullet"/>
-      <w:lvlText w:val=""/>
-      <w:lvlJc w:val="left"/>
-      <w:pPr>
-        <w:ind w:left="900" w:hanging="360"/>
-      </w:pPr>
-      <w:rPr>
-        <w:rFonts w:ascii="Wingdings" w:hAnsi="Wingdings" w:hint="default"/>
-      </w:rPr>
-    </w:lvl>
-    <w:lvl w:ilvl="1" w:tplc="FFFFFFFF">
-      <w:numFmt w:val="decimal"/>
-      <w:lvlText w:val=""/>
-      <w:lvlJc w:val="left"/>
-    </w:lvl>
-    <w:lvl w:ilvl="2" w:tplc="FFFFFFFF">
-      <w:numFmt w:val="decimal"/>
-      <w:lvlText w:val=""/>
-      <w:lvlJc w:val="left"/>
-    </w:lvl>
-    <w:lvl w:ilvl="3" w:tplc="FFFFFFFF">
-      <w:numFmt w:val="decimal"/>
-      <w:lvlText w:val=""/>
-      <w:lvlJc w:val="left"/>
-    </w:lvl>
-    <w:lvl w:ilvl="4" w:tplc="FFFFFFFF">
-      <w:numFmt w:val="decimal"/>
-      <w:lvlText w:val=""/>
-      <w:lvlJc w:val="left"/>
-    </w:lvl>
-    <w:lvl w:ilvl="5" w:tplc="FFFFFFFF">
-      <w:numFmt w:val="decimal"/>
-      <w:lvlText w:val=""/>
-      <w:lvlJc w:val="left"/>
-    </w:lvl>
-    <w:lvl w:ilvl="6" w:tplc="FFFFFFFF">
-      <w:numFmt w:val="decimal"/>
-      <w:lvlText w:val=""/>
-      <w:lvlJc w:val="left"/>
-    </w:lvl>
-    <w:lvl w:ilvl="7" w:tplc="FFFFFFFF">
-      <w:numFmt w:val="decimal"/>
-      <w:lvlText w:val=""/>
-      <w:lvlJc w:val="left"/>
-    </w:lvl>
-    <w:lvl w:ilvl="8" w:tplc="FFFFFFFF">
-      <w:numFmt w:val="decimal"/>
-      <w:lvlText w:val=""/>
-      <w:lvlJc w:val="left"/>
-    </w:lvl>
-  </w:abstractNum>
-  <w:abstractNum w:abstractNumId="8" w15:restartNumberingAfterBreak="0">
-    <w:nsid w:val="507C74D1"/>
-    <w:multiLevelType w:val="hybridMultilevel"/>
-    <w:tmpl w:val="FA88E9AC"/>
-    <w:lvl w:ilvl="0" w:tplc="02BA1A72">
+    <w:tmpl w:val="F4FC0A0E"/>
+    <w:lvl w:ilvl="0" w:tplc="12FCC248">
       <w:start w:val="1"/>
       <w:numFmt w:val="bullet"/>
       <w:lvlText w:val="●"/>
@@ -11961,7 +11534,7 @@
         <w:ind w:left="720" w:hanging="360"/>
       </w:pPr>
     </w:lvl>
-    <w:lvl w:ilvl="1" w:tplc="02F81DFA">
+    <w:lvl w:ilvl="1" w:tplc="F104BD5A">
       <w:start w:val="1"/>
       <w:numFmt w:val="bullet"/>
       <w:lvlText w:val="○"/>
@@ -11970,7 +11543,7 @@
         <w:ind w:left="1440" w:hanging="360"/>
       </w:pPr>
     </w:lvl>
-    <w:lvl w:ilvl="2" w:tplc="63E6DEE6">
+    <w:lvl w:ilvl="2" w:tplc="C1DCC686">
       <w:start w:val="1"/>
       <w:numFmt w:val="bullet"/>
       <w:lvlText w:val="■"/>
@@ -11979,7 +11552,7 @@
         <w:ind w:left="2160" w:hanging="360"/>
       </w:pPr>
     </w:lvl>
-    <w:lvl w:ilvl="3" w:tplc="DDF0DC78">
+    <w:lvl w:ilvl="3" w:tplc="80441482">
       <w:start w:val="1"/>
       <w:numFmt w:val="bullet"/>
       <w:lvlText w:val="●"/>
@@ -11988,7 +11561,7 @@
         <w:ind w:left="2880" w:hanging="360"/>
       </w:pPr>
     </w:lvl>
-    <w:lvl w:ilvl="4" w:tplc="8CBC6A50">
+    <w:lvl w:ilvl="4" w:tplc="4052F7C0">
       <w:start w:val="1"/>
       <w:numFmt w:val="bullet"/>
       <w:lvlText w:val="○"/>
@@ -11997,7 +11570,7 @@
         <w:ind w:left="3600" w:hanging="360"/>
       </w:pPr>
     </w:lvl>
-    <w:lvl w:ilvl="5" w:tplc="19309304">
+    <w:lvl w:ilvl="5" w:tplc="2C02B746">
       <w:start w:val="1"/>
       <w:numFmt w:val="bullet"/>
       <w:lvlText w:val="■"/>
@@ -12006,7 +11579,7 @@
         <w:ind w:left="4320" w:hanging="360"/>
       </w:pPr>
     </w:lvl>
-    <w:lvl w:ilvl="6" w:tplc="AE8C9E94">
+    <w:lvl w:ilvl="6" w:tplc="806E6818">
       <w:start w:val="1"/>
       <w:numFmt w:val="bullet"/>
       <w:lvlText w:val="●"/>
@@ -12015,7 +11588,7 @@
         <w:ind w:left="5040" w:hanging="360"/>
       </w:pPr>
     </w:lvl>
-    <w:lvl w:ilvl="7" w:tplc="10CCDDC0">
+    <w:lvl w:ilvl="7" w:tplc="C9B6F316">
       <w:start w:val="1"/>
       <w:numFmt w:val="bullet"/>
       <w:lvlText w:val="●"/>
@@ -12024,7 +11597,7 @@
         <w:ind w:left="5760" w:hanging="360"/>
       </w:pPr>
     </w:lvl>
-    <w:lvl w:ilvl="8" w:tplc="C082F754">
+    <w:lvl w:ilvl="8" w:tplc="3F7493AE">
       <w:start w:val="1"/>
       <w:numFmt w:val="bullet"/>
       <w:lvlText w:val="●"/>
@@ -12034,1101 +11607,23 @@
       </w:pPr>
     </w:lvl>
   </w:abstractNum>
-  <w:abstractNum w:abstractNumId="9" w15:restartNumberingAfterBreak="0">
-    <w:nsid w:val="5267035B"/>
-    <w:multiLevelType w:val="hybridMultilevel"/>
-    <w:tmpl w:val="21B436DA"/>
-    <w:lvl w:ilvl="0" w:tplc="2000000B">
-      <w:start w:val="1"/>
-      <w:numFmt w:val="bullet"/>
-      <w:lvlText w:val=""/>
-      <w:lvlJc w:val="left"/>
-      <w:pPr>
-        <w:ind w:left="720" w:hanging="360"/>
-      </w:pPr>
-      <w:rPr>
-        <w:rFonts w:ascii="Wingdings" w:hAnsi="Wingdings" w:hint="default"/>
-      </w:rPr>
-    </w:lvl>
-    <w:lvl w:ilvl="1" w:tplc="FFFFFFFF">
-      <w:numFmt w:val="decimal"/>
-      <w:lvlText w:val=""/>
-      <w:lvlJc w:val="left"/>
-    </w:lvl>
-    <w:lvl w:ilvl="2" w:tplc="FFFFFFFF">
-      <w:numFmt w:val="decimal"/>
-      <w:lvlText w:val=""/>
-      <w:lvlJc w:val="left"/>
-    </w:lvl>
-    <w:lvl w:ilvl="3" w:tplc="FFFFFFFF">
-      <w:numFmt w:val="decimal"/>
-      <w:lvlText w:val=""/>
-      <w:lvlJc w:val="left"/>
-    </w:lvl>
-    <w:lvl w:ilvl="4" w:tplc="FFFFFFFF">
-      <w:numFmt w:val="decimal"/>
-      <w:lvlText w:val=""/>
-      <w:lvlJc w:val="left"/>
-    </w:lvl>
-    <w:lvl w:ilvl="5" w:tplc="FFFFFFFF">
-      <w:numFmt w:val="decimal"/>
-      <w:lvlText w:val=""/>
-      <w:lvlJc w:val="left"/>
-    </w:lvl>
-    <w:lvl w:ilvl="6" w:tplc="FFFFFFFF">
-      <w:numFmt w:val="decimal"/>
-      <w:lvlText w:val=""/>
-      <w:lvlJc w:val="left"/>
-    </w:lvl>
-    <w:lvl w:ilvl="7" w:tplc="FFFFFFFF">
-      <w:numFmt w:val="decimal"/>
-      <w:lvlText w:val=""/>
-      <w:lvlJc w:val="left"/>
-    </w:lvl>
-    <w:lvl w:ilvl="8" w:tplc="FFFFFFFF">
-      <w:numFmt w:val="decimal"/>
-      <w:lvlText w:val=""/>
-      <w:lvlJc w:val="left"/>
-    </w:lvl>
-  </w:abstractNum>
-  <w:abstractNum w:abstractNumId="10" w15:restartNumberingAfterBreak="0">
-    <w:nsid w:val="56B06F92"/>
-    <w:multiLevelType w:val="hybridMultilevel"/>
-    <w:tmpl w:val="26668414"/>
-    <w:lvl w:ilvl="0" w:tplc="2000000B">
-      <w:start w:val="1"/>
-      <w:numFmt w:val="bullet"/>
-      <w:lvlText w:val=""/>
-      <w:lvlJc w:val="left"/>
-      <w:pPr>
-        <w:ind w:left="900" w:hanging="360"/>
-      </w:pPr>
-      <w:rPr>
-        <w:rFonts w:ascii="Wingdings" w:hAnsi="Wingdings" w:hint="default"/>
-      </w:rPr>
-    </w:lvl>
-    <w:lvl w:ilvl="1" w:tplc="20000003" w:tentative="1">
-      <w:start w:val="1"/>
-      <w:numFmt w:val="bullet"/>
-      <w:lvlText w:val="o"/>
-      <w:lvlJc w:val="left"/>
-      <w:pPr>
-        <w:ind w:left="1620" w:hanging="360"/>
-      </w:pPr>
-      <w:rPr>
-        <w:rFonts w:ascii="Courier New" w:hAnsi="Courier New" w:cs="Courier New" w:hint="default"/>
-      </w:rPr>
-    </w:lvl>
-    <w:lvl w:ilvl="2" w:tplc="20000005" w:tentative="1">
-      <w:start w:val="1"/>
-      <w:numFmt w:val="bullet"/>
-      <w:lvlText w:val=""/>
-      <w:lvlJc w:val="left"/>
-      <w:pPr>
-        <w:ind w:left="2340" w:hanging="360"/>
-      </w:pPr>
-      <w:rPr>
-        <w:rFonts w:ascii="Wingdings" w:hAnsi="Wingdings" w:hint="default"/>
-      </w:rPr>
-    </w:lvl>
-    <w:lvl w:ilvl="3" w:tplc="20000001" w:tentative="1">
-      <w:start w:val="1"/>
-      <w:numFmt w:val="bullet"/>
-      <w:lvlText w:val=""/>
-      <w:lvlJc w:val="left"/>
-      <w:pPr>
-        <w:ind w:left="3060" w:hanging="360"/>
-      </w:pPr>
-      <w:rPr>
-        <w:rFonts w:ascii="Symbol" w:hAnsi="Symbol" w:hint="default"/>
-      </w:rPr>
-    </w:lvl>
-    <w:lvl w:ilvl="4" w:tplc="20000003" w:tentative="1">
-      <w:start w:val="1"/>
-      <w:numFmt w:val="bullet"/>
-      <w:lvlText w:val="o"/>
-      <w:lvlJc w:val="left"/>
-      <w:pPr>
-        <w:ind w:left="3780" w:hanging="360"/>
-      </w:pPr>
-      <w:rPr>
-        <w:rFonts w:ascii="Courier New" w:hAnsi="Courier New" w:cs="Courier New" w:hint="default"/>
-      </w:rPr>
-    </w:lvl>
-    <w:lvl w:ilvl="5" w:tplc="20000005" w:tentative="1">
-      <w:start w:val="1"/>
-      <w:numFmt w:val="bullet"/>
-      <w:lvlText w:val=""/>
-      <w:lvlJc w:val="left"/>
-      <w:pPr>
-        <w:ind w:left="4500" w:hanging="360"/>
-      </w:pPr>
-      <w:rPr>
-        <w:rFonts w:ascii="Wingdings" w:hAnsi="Wingdings" w:hint="default"/>
-      </w:rPr>
-    </w:lvl>
-    <w:lvl w:ilvl="6" w:tplc="20000001" w:tentative="1">
-      <w:start w:val="1"/>
-      <w:numFmt w:val="bullet"/>
-      <w:lvlText w:val=""/>
-      <w:lvlJc w:val="left"/>
-      <w:pPr>
-        <w:ind w:left="5220" w:hanging="360"/>
-      </w:pPr>
-      <w:rPr>
-        <w:rFonts w:ascii="Symbol" w:hAnsi="Symbol" w:hint="default"/>
-      </w:rPr>
-    </w:lvl>
-    <w:lvl w:ilvl="7" w:tplc="20000003" w:tentative="1">
-      <w:start w:val="1"/>
-      <w:numFmt w:val="bullet"/>
-      <w:lvlText w:val="o"/>
-      <w:lvlJc w:val="left"/>
-      <w:pPr>
-        <w:ind w:left="5940" w:hanging="360"/>
-      </w:pPr>
-      <w:rPr>
-        <w:rFonts w:ascii="Courier New" w:hAnsi="Courier New" w:cs="Courier New" w:hint="default"/>
-      </w:rPr>
-    </w:lvl>
-    <w:lvl w:ilvl="8" w:tplc="20000005" w:tentative="1">
-      <w:start w:val="1"/>
-      <w:numFmt w:val="bullet"/>
-      <w:lvlText w:val=""/>
-      <w:lvlJc w:val="left"/>
-      <w:pPr>
-        <w:ind w:left="6660" w:hanging="360"/>
-      </w:pPr>
-      <w:rPr>
-        <w:rFonts w:ascii="Wingdings" w:hAnsi="Wingdings" w:hint="default"/>
-      </w:rPr>
-    </w:lvl>
-  </w:abstractNum>
-  <w:abstractNum w:abstractNumId="11" w15:restartNumberingAfterBreak="0">
-    <w:nsid w:val="57C27F9D"/>
-    <w:multiLevelType w:val="hybridMultilevel"/>
-    <w:tmpl w:val="22AA2C1C"/>
-    <w:lvl w:ilvl="0" w:tplc="2000000B">
-      <w:start w:val="1"/>
-      <w:numFmt w:val="bullet"/>
-      <w:lvlText w:val=""/>
-      <w:lvlJc w:val="left"/>
-      <w:pPr>
-        <w:ind w:left="720" w:hanging="360"/>
-      </w:pPr>
-      <w:rPr>
-        <w:rFonts w:ascii="Wingdings" w:hAnsi="Wingdings" w:hint="default"/>
-      </w:rPr>
-    </w:lvl>
-    <w:lvl w:ilvl="1" w:tplc="20000003" w:tentative="1">
-      <w:start w:val="1"/>
-      <w:numFmt w:val="bullet"/>
-      <w:lvlText w:val="o"/>
-      <w:lvlJc w:val="left"/>
-      <w:pPr>
-        <w:ind w:left="1440" w:hanging="360"/>
-      </w:pPr>
-      <w:rPr>
-        <w:rFonts w:ascii="Courier New" w:hAnsi="Courier New" w:cs="Courier New" w:hint="default"/>
-      </w:rPr>
-    </w:lvl>
-    <w:lvl w:ilvl="2" w:tplc="20000005" w:tentative="1">
-      <w:start w:val="1"/>
-      <w:numFmt w:val="bullet"/>
-      <w:lvlText w:val=""/>
-      <w:lvlJc w:val="left"/>
-      <w:pPr>
-        <w:ind w:left="2160" w:hanging="360"/>
-      </w:pPr>
-      <w:rPr>
-        <w:rFonts w:ascii="Wingdings" w:hAnsi="Wingdings" w:hint="default"/>
-      </w:rPr>
-    </w:lvl>
-    <w:lvl w:ilvl="3" w:tplc="20000001" w:tentative="1">
-      <w:start w:val="1"/>
-      <w:numFmt w:val="bullet"/>
-      <w:lvlText w:val=""/>
-      <w:lvlJc w:val="left"/>
-      <w:pPr>
-        <w:ind w:left="2880" w:hanging="360"/>
-      </w:pPr>
-      <w:rPr>
-        <w:rFonts w:ascii="Symbol" w:hAnsi="Symbol" w:hint="default"/>
-      </w:rPr>
-    </w:lvl>
-    <w:lvl w:ilvl="4" w:tplc="20000003" w:tentative="1">
-      <w:start w:val="1"/>
-      <w:numFmt w:val="bullet"/>
-      <w:lvlText w:val="o"/>
-      <w:lvlJc w:val="left"/>
-      <w:pPr>
-        <w:ind w:left="3600" w:hanging="360"/>
-      </w:pPr>
-      <w:rPr>
-        <w:rFonts w:ascii="Courier New" w:hAnsi="Courier New" w:cs="Courier New" w:hint="default"/>
-      </w:rPr>
-    </w:lvl>
-    <w:lvl w:ilvl="5" w:tplc="20000005" w:tentative="1">
-      <w:start w:val="1"/>
-      <w:numFmt w:val="bullet"/>
-      <w:lvlText w:val=""/>
-      <w:lvlJc w:val="left"/>
-      <w:pPr>
-        <w:ind w:left="4320" w:hanging="360"/>
-      </w:pPr>
-      <w:rPr>
-        <w:rFonts w:ascii="Wingdings" w:hAnsi="Wingdings" w:hint="default"/>
-      </w:rPr>
-    </w:lvl>
-    <w:lvl w:ilvl="6" w:tplc="20000001" w:tentative="1">
-      <w:start w:val="1"/>
-      <w:numFmt w:val="bullet"/>
-      <w:lvlText w:val=""/>
-      <w:lvlJc w:val="left"/>
-      <w:pPr>
-        <w:ind w:left="5040" w:hanging="360"/>
-      </w:pPr>
-      <w:rPr>
-        <w:rFonts w:ascii="Symbol" w:hAnsi="Symbol" w:hint="default"/>
-      </w:rPr>
-    </w:lvl>
-    <w:lvl w:ilvl="7" w:tplc="20000003" w:tentative="1">
-      <w:start w:val="1"/>
-      <w:numFmt w:val="bullet"/>
-      <w:lvlText w:val="o"/>
-      <w:lvlJc w:val="left"/>
-      <w:pPr>
-        <w:ind w:left="5760" w:hanging="360"/>
-      </w:pPr>
-      <w:rPr>
-        <w:rFonts w:ascii="Courier New" w:hAnsi="Courier New" w:cs="Courier New" w:hint="default"/>
-      </w:rPr>
-    </w:lvl>
-    <w:lvl w:ilvl="8" w:tplc="20000005" w:tentative="1">
-      <w:start w:val="1"/>
-      <w:numFmt w:val="bullet"/>
-      <w:lvlText w:val=""/>
-      <w:lvlJc w:val="left"/>
-      <w:pPr>
-        <w:ind w:left="6480" w:hanging="360"/>
-      </w:pPr>
-      <w:rPr>
-        <w:rFonts w:ascii="Wingdings" w:hAnsi="Wingdings" w:hint="default"/>
-      </w:rPr>
-    </w:lvl>
-  </w:abstractNum>
-  <w:abstractNum w:abstractNumId="12" w15:restartNumberingAfterBreak="0">
-    <w:nsid w:val="5AD606FC"/>
-    <w:multiLevelType w:val="hybridMultilevel"/>
-    <w:tmpl w:val="4FC4614C"/>
-    <w:lvl w:ilvl="0" w:tplc="2000000B">
-      <w:start w:val="1"/>
-      <w:numFmt w:val="bullet"/>
-      <w:lvlText w:val=""/>
-      <w:lvlJc w:val="left"/>
-      <w:pPr>
-        <w:ind w:left="900" w:hanging="360"/>
-      </w:pPr>
-      <w:rPr>
-        <w:rFonts w:ascii="Wingdings" w:hAnsi="Wingdings" w:hint="default"/>
-      </w:rPr>
-    </w:lvl>
-    <w:lvl w:ilvl="1" w:tplc="FFFFFFFF">
-      <w:numFmt w:val="decimal"/>
-      <w:lvlText w:val=""/>
-      <w:lvlJc w:val="left"/>
-    </w:lvl>
-    <w:lvl w:ilvl="2" w:tplc="FFFFFFFF">
-      <w:numFmt w:val="decimal"/>
-      <w:lvlText w:val=""/>
-      <w:lvlJc w:val="left"/>
-    </w:lvl>
-    <w:lvl w:ilvl="3" w:tplc="FFFFFFFF">
-      <w:numFmt w:val="decimal"/>
-      <w:lvlText w:val=""/>
-      <w:lvlJc w:val="left"/>
-    </w:lvl>
-    <w:lvl w:ilvl="4" w:tplc="FFFFFFFF">
-      <w:numFmt w:val="decimal"/>
-      <w:lvlText w:val=""/>
-      <w:lvlJc w:val="left"/>
-    </w:lvl>
-    <w:lvl w:ilvl="5" w:tplc="FFFFFFFF">
-      <w:numFmt w:val="decimal"/>
-      <w:lvlText w:val=""/>
-      <w:lvlJc w:val="left"/>
-    </w:lvl>
-    <w:lvl w:ilvl="6" w:tplc="FFFFFFFF">
-      <w:numFmt w:val="decimal"/>
-      <w:lvlText w:val=""/>
-      <w:lvlJc w:val="left"/>
-    </w:lvl>
-    <w:lvl w:ilvl="7" w:tplc="FFFFFFFF">
-      <w:numFmt w:val="decimal"/>
-      <w:lvlText w:val=""/>
-      <w:lvlJc w:val="left"/>
-    </w:lvl>
-    <w:lvl w:ilvl="8" w:tplc="FFFFFFFF">
-      <w:numFmt w:val="decimal"/>
-      <w:lvlText w:val=""/>
-      <w:lvlJc w:val="left"/>
-    </w:lvl>
-  </w:abstractNum>
-  <w:abstractNum w:abstractNumId="13" w15:restartNumberingAfterBreak="0">
-    <w:nsid w:val="5BDA0D79"/>
-    <w:multiLevelType w:val="hybridMultilevel"/>
-    <w:tmpl w:val="D7C09828"/>
-    <w:lvl w:ilvl="0" w:tplc="2000000D">
-      <w:start w:val="1"/>
-      <w:numFmt w:val="bullet"/>
-      <w:lvlText w:val=""/>
-      <w:lvlJc w:val="left"/>
-      <w:pPr>
-        <w:ind w:left="900" w:hanging="360"/>
-      </w:pPr>
-      <w:rPr>
-        <w:rFonts w:ascii="Wingdings" w:hAnsi="Wingdings" w:hint="default"/>
-      </w:rPr>
-    </w:lvl>
-    <w:lvl w:ilvl="1" w:tplc="FFFFFFFF">
-      <w:numFmt w:val="decimal"/>
-      <w:lvlText w:val=""/>
-      <w:lvlJc w:val="left"/>
-    </w:lvl>
-    <w:lvl w:ilvl="2" w:tplc="FFFFFFFF">
-      <w:numFmt w:val="decimal"/>
-      <w:lvlText w:val=""/>
-      <w:lvlJc w:val="left"/>
-    </w:lvl>
-    <w:lvl w:ilvl="3" w:tplc="FFFFFFFF">
-      <w:numFmt w:val="decimal"/>
-      <w:lvlText w:val=""/>
-      <w:lvlJc w:val="left"/>
-    </w:lvl>
-    <w:lvl w:ilvl="4" w:tplc="FFFFFFFF">
-      <w:numFmt w:val="decimal"/>
-      <w:lvlText w:val=""/>
-      <w:lvlJc w:val="left"/>
-    </w:lvl>
-    <w:lvl w:ilvl="5" w:tplc="FFFFFFFF">
-      <w:numFmt w:val="decimal"/>
-      <w:lvlText w:val=""/>
-      <w:lvlJc w:val="left"/>
-    </w:lvl>
-    <w:lvl w:ilvl="6" w:tplc="FFFFFFFF">
-      <w:numFmt w:val="decimal"/>
-      <w:lvlText w:val=""/>
-      <w:lvlJc w:val="left"/>
-    </w:lvl>
-    <w:lvl w:ilvl="7" w:tplc="FFFFFFFF">
-      <w:numFmt w:val="decimal"/>
-      <w:lvlText w:val=""/>
-      <w:lvlJc w:val="left"/>
-    </w:lvl>
-    <w:lvl w:ilvl="8" w:tplc="FFFFFFFF">
-      <w:numFmt w:val="decimal"/>
-      <w:lvlText w:val=""/>
-      <w:lvlJc w:val="left"/>
-    </w:lvl>
-  </w:abstractNum>
-  <w:abstractNum w:abstractNumId="14" w15:restartNumberingAfterBreak="0">
-    <w:nsid w:val="6D6D3BA1"/>
-    <w:multiLevelType w:val="hybridMultilevel"/>
-    <w:tmpl w:val="82B007D0"/>
-    <w:lvl w:ilvl="0" w:tplc="2000000B">
-      <w:start w:val="1"/>
-      <w:numFmt w:val="bullet"/>
-      <w:lvlText w:val=""/>
-      <w:lvlJc w:val="left"/>
-      <w:pPr>
-        <w:ind w:left="720" w:hanging="360"/>
-      </w:pPr>
-      <w:rPr>
-        <w:rFonts w:ascii="Wingdings" w:hAnsi="Wingdings" w:hint="default"/>
-      </w:rPr>
-    </w:lvl>
-    <w:lvl w:ilvl="1" w:tplc="20000003" w:tentative="1">
-      <w:start w:val="1"/>
-      <w:numFmt w:val="bullet"/>
-      <w:lvlText w:val="o"/>
-      <w:lvlJc w:val="left"/>
-      <w:pPr>
-        <w:ind w:left="1440" w:hanging="360"/>
-      </w:pPr>
-      <w:rPr>
-        <w:rFonts w:ascii="Courier New" w:hAnsi="Courier New" w:cs="Courier New" w:hint="default"/>
-      </w:rPr>
-    </w:lvl>
-    <w:lvl w:ilvl="2" w:tplc="20000005" w:tentative="1">
-      <w:start w:val="1"/>
-      <w:numFmt w:val="bullet"/>
-      <w:lvlText w:val=""/>
-      <w:lvlJc w:val="left"/>
-      <w:pPr>
-        <w:ind w:left="2160" w:hanging="360"/>
-      </w:pPr>
-      <w:rPr>
-        <w:rFonts w:ascii="Wingdings" w:hAnsi="Wingdings" w:hint="default"/>
-      </w:rPr>
-    </w:lvl>
-    <w:lvl w:ilvl="3" w:tplc="20000001" w:tentative="1">
-      <w:start w:val="1"/>
-      <w:numFmt w:val="bullet"/>
-      <w:lvlText w:val=""/>
-      <w:lvlJc w:val="left"/>
-      <w:pPr>
-        <w:ind w:left="2880" w:hanging="360"/>
-      </w:pPr>
-      <w:rPr>
-        <w:rFonts w:ascii="Symbol" w:hAnsi="Symbol" w:hint="default"/>
-      </w:rPr>
-    </w:lvl>
-    <w:lvl w:ilvl="4" w:tplc="20000003" w:tentative="1">
-      <w:start w:val="1"/>
-      <w:numFmt w:val="bullet"/>
-      <w:lvlText w:val="o"/>
-      <w:lvlJc w:val="left"/>
-      <w:pPr>
-        <w:ind w:left="3600" w:hanging="360"/>
-      </w:pPr>
-      <w:rPr>
-        <w:rFonts w:ascii="Courier New" w:hAnsi="Courier New" w:cs="Courier New" w:hint="default"/>
-      </w:rPr>
-    </w:lvl>
-    <w:lvl w:ilvl="5" w:tplc="20000005" w:tentative="1">
-      <w:start w:val="1"/>
-      <w:numFmt w:val="bullet"/>
-      <w:lvlText w:val=""/>
-      <w:lvlJc w:val="left"/>
-      <w:pPr>
-        <w:ind w:left="4320" w:hanging="360"/>
-      </w:pPr>
-      <w:rPr>
-        <w:rFonts w:ascii="Wingdings" w:hAnsi="Wingdings" w:hint="default"/>
-      </w:rPr>
-    </w:lvl>
-    <w:lvl w:ilvl="6" w:tplc="20000001" w:tentative="1">
-      <w:start w:val="1"/>
-      <w:numFmt w:val="bullet"/>
-      <w:lvlText w:val=""/>
-      <w:lvlJc w:val="left"/>
-      <w:pPr>
-        <w:ind w:left="5040" w:hanging="360"/>
-      </w:pPr>
-      <w:rPr>
-        <w:rFonts w:ascii="Symbol" w:hAnsi="Symbol" w:hint="default"/>
-      </w:rPr>
-    </w:lvl>
-    <w:lvl w:ilvl="7" w:tplc="20000003" w:tentative="1">
-      <w:start w:val="1"/>
-      <w:numFmt w:val="bullet"/>
-      <w:lvlText w:val="o"/>
-      <w:lvlJc w:val="left"/>
-      <w:pPr>
-        <w:ind w:left="5760" w:hanging="360"/>
-      </w:pPr>
-      <w:rPr>
-        <w:rFonts w:ascii="Courier New" w:hAnsi="Courier New" w:cs="Courier New" w:hint="default"/>
-      </w:rPr>
-    </w:lvl>
-    <w:lvl w:ilvl="8" w:tplc="20000005" w:tentative="1">
-      <w:start w:val="1"/>
-      <w:numFmt w:val="bullet"/>
-      <w:lvlText w:val=""/>
-      <w:lvlJc w:val="left"/>
-      <w:pPr>
-        <w:ind w:left="6480" w:hanging="360"/>
-      </w:pPr>
-      <w:rPr>
-        <w:rFonts w:ascii="Wingdings" w:hAnsi="Wingdings" w:hint="default"/>
-      </w:rPr>
-    </w:lvl>
-  </w:abstractNum>
-  <w:abstractNum w:abstractNumId="15" w15:restartNumberingAfterBreak="0">
-    <w:nsid w:val="6EDF2ED6"/>
-    <w:multiLevelType w:val="hybridMultilevel"/>
-    <w:tmpl w:val="4B627CD8"/>
-    <w:lvl w:ilvl="0" w:tplc="2000000B">
-      <w:start w:val="1"/>
-      <w:numFmt w:val="bullet"/>
-      <w:lvlText w:val=""/>
-      <w:lvlJc w:val="left"/>
-      <w:pPr>
-        <w:ind w:left="900" w:hanging="360"/>
-      </w:pPr>
-      <w:rPr>
-        <w:rFonts w:ascii="Wingdings" w:hAnsi="Wingdings" w:hint="default"/>
-      </w:rPr>
-    </w:lvl>
-    <w:lvl w:ilvl="1" w:tplc="FFFFFFFF">
-      <w:numFmt w:val="decimal"/>
-      <w:lvlText w:val=""/>
-      <w:lvlJc w:val="left"/>
-    </w:lvl>
-    <w:lvl w:ilvl="2" w:tplc="FFFFFFFF">
-      <w:numFmt w:val="decimal"/>
-      <w:lvlText w:val=""/>
-      <w:lvlJc w:val="left"/>
-    </w:lvl>
-    <w:lvl w:ilvl="3" w:tplc="FFFFFFFF">
-      <w:numFmt w:val="decimal"/>
-      <w:lvlText w:val=""/>
-      <w:lvlJc w:val="left"/>
-    </w:lvl>
-    <w:lvl w:ilvl="4" w:tplc="FFFFFFFF">
-      <w:numFmt w:val="decimal"/>
-      <w:lvlText w:val=""/>
-      <w:lvlJc w:val="left"/>
-    </w:lvl>
-    <w:lvl w:ilvl="5" w:tplc="FFFFFFFF">
-      <w:numFmt w:val="decimal"/>
-      <w:lvlText w:val=""/>
-      <w:lvlJc w:val="left"/>
-    </w:lvl>
-    <w:lvl w:ilvl="6" w:tplc="FFFFFFFF">
-      <w:numFmt w:val="decimal"/>
-      <w:lvlText w:val=""/>
-      <w:lvlJc w:val="left"/>
-    </w:lvl>
-    <w:lvl w:ilvl="7" w:tplc="FFFFFFFF">
-      <w:numFmt w:val="decimal"/>
-      <w:lvlText w:val=""/>
-      <w:lvlJc w:val="left"/>
-    </w:lvl>
-    <w:lvl w:ilvl="8" w:tplc="FFFFFFFF">
-      <w:numFmt w:val="decimal"/>
-      <w:lvlText w:val=""/>
-      <w:lvlJc w:val="left"/>
-    </w:lvl>
-  </w:abstractNum>
-  <w:abstractNum w:abstractNumId="16" w15:restartNumberingAfterBreak="0">
-    <w:nsid w:val="6EEC2DEE"/>
-    <w:multiLevelType w:val="hybridMultilevel"/>
-    <w:tmpl w:val="08EA5C2A"/>
-    <w:lvl w:ilvl="0" w:tplc="2000000B">
-      <w:start w:val="1"/>
-      <w:numFmt w:val="bullet"/>
-      <w:lvlText w:val=""/>
-      <w:lvlJc w:val="left"/>
-      <w:pPr>
-        <w:ind w:left="540" w:hanging="360"/>
-      </w:pPr>
-      <w:rPr>
-        <w:rFonts w:ascii="Wingdings" w:hAnsi="Wingdings" w:hint="default"/>
-      </w:rPr>
-    </w:lvl>
-    <w:lvl w:ilvl="1" w:tplc="FFFFFFFF">
-      <w:numFmt w:val="decimal"/>
-      <w:lvlText w:val=""/>
-      <w:lvlJc w:val="left"/>
-    </w:lvl>
-    <w:lvl w:ilvl="2" w:tplc="FFFFFFFF">
-      <w:numFmt w:val="decimal"/>
-      <w:lvlText w:val=""/>
-      <w:lvlJc w:val="left"/>
-    </w:lvl>
-    <w:lvl w:ilvl="3" w:tplc="FFFFFFFF">
-      <w:numFmt w:val="decimal"/>
-      <w:lvlText w:val=""/>
-      <w:lvlJc w:val="left"/>
-    </w:lvl>
-    <w:lvl w:ilvl="4" w:tplc="FFFFFFFF">
-      <w:numFmt w:val="decimal"/>
-      <w:lvlText w:val=""/>
-      <w:lvlJc w:val="left"/>
-    </w:lvl>
-    <w:lvl w:ilvl="5" w:tplc="FFFFFFFF">
-      <w:numFmt w:val="decimal"/>
-      <w:lvlText w:val=""/>
-      <w:lvlJc w:val="left"/>
-    </w:lvl>
-    <w:lvl w:ilvl="6" w:tplc="FFFFFFFF">
-      <w:numFmt w:val="decimal"/>
-      <w:lvlText w:val=""/>
-      <w:lvlJc w:val="left"/>
-    </w:lvl>
-    <w:lvl w:ilvl="7" w:tplc="FFFFFFFF">
-      <w:numFmt w:val="decimal"/>
-      <w:lvlText w:val=""/>
-      <w:lvlJc w:val="left"/>
-    </w:lvl>
-    <w:lvl w:ilvl="8" w:tplc="FFFFFFFF">
-      <w:numFmt w:val="decimal"/>
-      <w:lvlText w:val=""/>
-      <w:lvlJc w:val="left"/>
-    </w:lvl>
-  </w:abstractNum>
-  <w:abstractNum w:abstractNumId="17" w15:restartNumberingAfterBreak="0">
-    <w:nsid w:val="74BD5456"/>
-    <w:multiLevelType w:val="hybridMultilevel"/>
-    <w:tmpl w:val="1F26423E"/>
-    <w:lvl w:ilvl="0" w:tplc="908CB666">
-      <w:start w:val="1"/>
-      <w:numFmt w:val="decimal"/>
-      <w:lvlText w:val="%1."/>
-      <w:lvlJc w:val="left"/>
-      <w:pPr>
-        <w:ind w:left="900" w:hanging="360"/>
-      </w:pPr>
-      <w:rPr>
-        <w:rFonts w:ascii="Arial" w:eastAsia="Arial" w:hAnsi="Arial" w:cs="Arial"/>
-      </w:rPr>
-    </w:lvl>
-    <w:lvl w:ilvl="1" w:tplc="8228BBC6">
-      <w:numFmt w:val="decimal"/>
-      <w:lvlText w:val=""/>
-      <w:lvlJc w:val="left"/>
-    </w:lvl>
-    <w:lvl w:ilvl="2" w:tplc="373AFBF4">
-      <w:numFmt w:val="decimal"/>
-      <w:lvlText w:val=""/>
-      <w:lvlJc w:val="left"/>
-    </w:lvl>
-    <w:lvl w:ilvl="3" w:tplc="6226B2F8">
-      <w:numFmt w:val="decimal"/>
-      <w:lvlText w:val=""/>
-      <w:lvlJc w:val="left"/>
-    </w:lvl>
-    <w:lvl w:ilvl="4" w:tplc="7B34EEE6">
-      <w:numFmt w:val="decimal"/>
-      <w:lvlText w:val=""/>
-      <w:lvlJc w:val="left"/>
-    </w:lvl>
-    <w:lvl w:ilvl="5" w:tplc="876A8F58">
-      <w:numFmt w:val="decimal"/>
-      <w:lvlText w:val=""/>
-      <w:lvlJc w:val="left"/>
-    </w:lvl>
-    <w:lvl w:ilvl="6" w:tplc="BF1AE582">
-      <w:numFmt w:val="decimal"/>
-      <w:lvlText w:val=""/>
-      <w:lvlJc w:val="left"/>
-    </w:lvl>
-    <w:lvl w:ilvl="7" w:tplc="292003B8">
-      <w:numFmt w:val="decimal"/>
-      <w:lvlText w:val=""/>
-      <w:lvlJc w:val="left"/>
-    </w:lvl>
-    <w:lvl w:ilvl="8" w:tplc="2262888E">
-      <w:numFmt w:val="decimal"/>
-      <w:lvlText w:val=""/>
-      <w:lvlJc w:val="left"/>
-    </w:lvl>
-  </w:abstractNum>
-  <w:abstractNum w:abstractNumId="18" w15:restartNumberingAfterBreak="0">
-    <w:nsid w:val="771B20EA"/>
-    <w:multiLevelType w:val="hybridMultilevel"/>
-    <w:tmpl w:val="C12E882E"/>
-    <w:lvl w:ilvl="0" w:tplc="2000000B">
-      <w:start w:val="1"/>
-      <w:numFmt w:val="bullet"/>
-      <w:lvlText w:val=""/>
-      <w:lvlJc w:val="left"/>
-      <w:pPr>
-        <w:ind w:left="720" w:hanging="360"/>
-      </w:pPr>
-      <w:rPr>
-        <w:rFonts w:ascii="Wingdings" w:hAnsi="Wingdings" w:hint="default"/>
-      </w:rPr>
-    </w:lvl>
-    <w:lvl w:ilvl="1" w:tplc="20000003" w:tentative="1">
-      <w:start w:val="1"/>
-      <w:numFmt w:val="bullet"/>
-      <w:lvlText w:val="o"/>
-      <w:lvlJc w:val="left"/>
-      <w:pPr>
-        <w:ind w:left="1440" w:hanging="360"/>
-      </w:pPr>
-      <w:rPr>
-        <w:rFonts w:ascii="Courier New" w:hAnsi="Courier New" w:cs="Courier New" w:hint="default"/>
-      </w:rPr>
-    </w:lvl>
-    <w:lvl w:ilvl="2" w:tplc="20000005" w:tentative="1">
-      <w:start w:val="1"/>
-      <w:numFmt w:val="bullet"/>
-      <w:lvlText w:val=""/>
-      <w:lvlJc w:val="left"/>
-      <w:pPr>
-        <w:ind w:left="2160" w:hanging="360"/>
-      </w:pPr>
-      <w:rPr>
-        <w:rFonts w:ascii="Wingdings" w:hAnsi="Wingdings" w:hint="default"/>
-      </w:rPr>
-    </w:lvl>
-    <w:lvl w:ilvl="3" w:tplc="20000001" w:tentative="1">
-      <w:start w:val="1"/>
-      <w:numFmt w:val="bullet"/>
-      <w:lvlText w:val=""/>
-      <w:lvlJc w:val="left"/>
-      <w:pPr>
-        <w:ind w:left="2880" w:hanging="360"/>
-      </w:pPr>
-      <w:rPr>
-        <w:rFonts w:ascii="Symbol" w:hAnsi="Symbol" w:hint="default"/>
-      </w:rPr>
-    </w:lvl>
-    <w:lvl w:ilvl="4" w:tplc="20000003" w:tentative="1">
-      <w:start w:val="1"/>
-      <w:numFmt w:val="bullet"/>
-      <w:lvlText w:val="o"/>
-      <w:lvlJc w:val="left"/>
-      <w:pPr>
-        <w:ind w:left="3600" w:hanging="360"/>
-      </w:pPr>
-      <w:rPr>
-        <w:rFonts w:ascii="Courier New" w:hAnsi="Courier New" w:cs="Courier New" w:hint="default"/>
-      </w:rPr>
-    </w:lvl>
-    <w:lvl w:ilvl="5" w:tplc="20000005" w:tentative="1">
-      <w:start w:val="1"/>
-      <w:numFmt w:val="bullet"/>
-      <w:lvlText w:val=""/>
-      <w:lvlJc w:val="left"/>
-      <w:pPr>
-        <w:ind w:left="4320" w:hanging="360"/>
-      </w:pPr>
-      <w:rPr>
-        <w:rFonts w:ascii="Wingdings" w:hAnsi="Wingdings" w:hint="default"/>
-      </w:rPr>
-    </w:lvl>
-    <w:lvl w:ilvl="6" w:tplc="20000001" w:tentative="1">
-      <w:start w:val="1"/>
-      <w:numFmt w:val="bullet"/>
-      <w:lvlText w:val=""/>
-      <w:lvlJc w:val="left"/>
-      <w:pPr>
-        <w:ind w:left="5040" w:hanging="360"/>
-      </w:pPr>
-      <w:rPr>
-        <w:rFonts w:ascii="Symbol" w:hAnsi="Symbol" w:hint="default"/>
-      </w:rPr>
-    </w:lvl>
-    <w:lvl w:ilvl="7" w:tplc="20000003" w:tentative="1">
-      <w:start w:val="1"/>
-      <w:numFmt w:val="bullet"/>
-      <w:lvlText w:val="o"/>
-      <w:lvlJc w:val="left"/>
-      <w:pPr>
-        <w:ind w:left="5760" w:hanging="360"/>
-      </w:pPr>
-      <w:rPr>
-        <w:rFonts w:ascii="Courier New" w:hAnsi="Courier New" w:cs="Courier New" w:hint="default"/>
-      </w:rPr>
-    </w:lvl>
-    <w:lvl w:ilvl="8" w:tplc="20000005" w:tentative="1">
-      <w:start w:val="1"/>
-      <w:numFmt w:val="bullet"/>
-      <w:lvlText w:val=""/>
-      <w:lvlJc w:val="left"/>
-      <w:pPr>
-        <w:ind w:left="6480" w:hanging="360"/>
-      </w:pPr>
-      <w:rPr>
-        <w:rFonts w:ascii="Wingdings" w:hAnsi="Wingdings" w:hint="default"/>
-      </w:rPr>
-    </w:lvl>
-  </w:abstractNum>
-  <w:abstractNum w:abstractNumId="19" w15:restartNumberingAfterBreak="0">
-    <w:nsid w:val="7A4B5DD0"/>
-    <w:multiLevelType w:val="hybridMultilevel"/>
-    <w:tmpl w:val="401498D4"/>
-    <w:lvl w:ilvl="0" w:tplc="2000000B">
-      <w:start w:val="1"/>
-      <w:numFmt w:val="bullet"/>
-      <w:lvlText w:val=""/>
-      <w:lvlJc w:val="left"/>
-      <w:pPr>
-        <w:ind w:left="1080" w:hanging="360"/>
-      </w:pPr>
-      <w:rPr>
-        <w:rFonts w:ascii="Wingdings" w:hAnsi="Wingdings" w:hint="default"/>
-      </w:rPr>
-    </w:lvl>
-    <w:lvl w:ilvl="1" w:tplc="FFFFFFFF">
-      <w:numFmt w:val="decimal"/>
-      <w:lvlText w:val=""/>
-      <w:lvlJc w:val="left"/>
-    </w:lvl>
-    <w:lvl w:ilvl="2" w:tplc="FFFFFFFF">
-      <w:numFmt w:val="decimal"/>
-      <w:lvlText w:val=""/>
-      <w:lvlJc w:val="left"/>
-    </w:lvl>
-    <w:lvl w:ilvl="3" w:tplc="FFFFFFFF">
-      <w:numFmt w:val="decimal"/>
-      <w:lvlText w:val=""/>
-      <w:lvlJc w:val="left"/>
-    </w:lvl>
-    <w:lvl w:ilvl="4" w:tplc="FFFFFFFF">
-      <w:numFmt w:val="decimal"/>
-      <w:lvlText w:val=""/>
-      <w:lvlJc w:val="left"/>
-    </w:lvl>
-    <w:lvl w:ilvl="5" w:tplc="FFFFFFFF">
-      <w:numFmt w:val="decimal"/>
-      <w:lvlText w:val=""/>
-      <w:lvlJc w:val="left"/>
-    </w:lvl>
-    <w:lvl w:ilvl="6" w:tplc="FFFFFFFF">
-      <w:numFmt w:val="decimal"/>
-      <w:lvlText w:val=""/>
-      <w:lvlJc w:val="left"/>
-    </w:lvl>
-    <w:lvl w:ilvl="7" w:tplc="FFFFFFFF">
-      <w:numFmt w:val="decimal"/>
-      <w:lvlText w:val=""/>
-      <w:lvlJc w:val="left"/>
-    </w:lvl>
-    <w:lvl w:ilvl="8" w:tplc="FFFFFFFF">
-      <w:numFmt w:val="decimal"/>
-      <w:lvlText w:val=""/>
-      <w:lvlJc w:val="left"/>
-    </w:lvl>
-  </w:abstractNum>
-  <w:abstractNum w:abstractNumId="20" w15:restartNumberingAfterBreak="0">
-    <w:nsid w:val="7CBD3EB8"/>
-    <w:multiLevelType w:val="hybridMultilevel"/>
-    <w:tmpl w:val="3BAC8886"/>
-    <w:lvl w:ilvl="0" w:tplc="2000000B">
-      <w:start w:val="1"/>
-      <w:numFmt w:val="bullet"/>
-      <w:lvlText w:val=""/>
-      <w:lvlJc w:val="left"/>
-      <w:pPr>
-        <w:ind w:left="1260" w:hanging="360"/>
-      </w:pPr>
-      <w:rPr>
-        <w:rFonts w:ascii="Wingdings" w:hAnsi="Wingdings" w:hint="default"/>
-      </w:rPr>
-    </w:lvl>
-    <w:lvl w:ilvl="1" w:tplc="FFFFFFFF" w:tentative="1">
-      <w:start w:val="1"/>
-      <w:numFmt w:val="bullet"/>
-      <w:lvlText w:val="o"/>
-      <w:lvlJc w:val="left"/>
-      <w:pPr>
-        <w:ind w:left="1980" w:hanging="360"/>
-      </w:pPr>
-      <w:rPr>
-        <w:rFonts w:ascii="Courier New" w:hAnsi="Courier New" w:cs="Courier New" w:hint="default"/>
-      </w:rPr>
-    </w:lvl>
-    <w:lvl w:ilvl="2" w:tplc="FFFFFFFF" w:tentative="1">
-      <w:start w:val="1"/>
-      <w:numFmt w:val="bullet"/>
-      <w:lvlText w:val=""/>
-      <w:lvlJc w:val="left"/>
-      <w:pPr>
-        <w:ind w:left="2700" w:hanging="360"/>
-      </w:pPr>
-      <w:rPr>
-        <w:rFonts w:ascii="Wingdings" w:hAnsi="Wingdings" w:hint="default"/>
-      </w:rPr>
-    </w:lvl>
-    <w:lvl w:ilvl="3" w:tplc="FFFFFFFF" w:tentative="1">
-      <w:start w:val="1"/>
-      <w:numFmt w:val="bullet"/>
-      <w:lvlText w:val=""/>
-      <w:lvlJc w:val="left"/>
-      <w:pPr>
-        <w:ind w:left="3420" w:hanging="360"/>
-      </w:pPr>
-      <w:rPr>
-        <w:rFonts w:ascii="Symbol" w:hAnsi="Symbol" w:hint="default"/>
-      </w:rPr>
-    </w:lvl>
-    <w:lvl w:ilvl="4" w:tplc="FFFFFFFF" w:tentative="1">
-      <w:start w:val="1"/>
-      <w:numFmt w:val="bullet"/>
-      <w:lvlText w:val="o"/>
-      <w:lvlJc w:val="left"/>
-      <w:pPr>
-        <w:ind w:left="4140" w:hanging="360"/>
-      </w:pPr>
-      <w:rPr>
-        <w:rFonts w:ascii="Courier New" w:hAnsi="Courier New" w:cs="Courier New" w:hint="default"/>
-      </w:rPr>
-    </w:lvl>
-    <w:lvl w:ilvl="5" w:tplc="FFFFFFFF" w:tentative="1">
-      <w:start w:val="1"/>
-      <w:numFmt w:val="bullet"/>
-      <w:lvlText w:val=""/>
-      <w:lvlJc w:val="left"/>
-      <w:pPr>
-        <w:ind w:left="4860" w:hanging="360"/>
-      </w:pPr>
-      <w:rPr>
-        <w:rFonts w:ascii="Wingdings" w:hAnsi="Wingdings" w:hint="default"/>
-      </w:rPr>
-    </w:lvl>
-    <w:lvl w:ilvl="6" w:tplc="FFFFFFFF" w:tentative="1">
-      <w:start w:val="1"/>
-      <w:numFmt w:val="bullet"/>
-      <w:lvlText w:val=""/>
-      <w:lvlJc w:val="left"/>
-      <w:pPr>
-        <w:ind w:left="5580" w:hanging="360"/>
-      </w:pPr>
-      <w:rPr>
-        <w:rFonts w:ascii="Symbol" w:hAnsi="Symbol" w:hint="default"/>
-      </w:rPr>
-    </w:lvl>
-    <w:lvl w:ilvl="7" w:tplc="FFFFFFFF" w:tentative="1">
-      <w:start w:val="1"/>
-      <w:numFmt w:val="bullet"/>
-      <w:lvlText w:val="o"/>
-      <w:lvlJc w:val="left"/>
-      <w:pPr>
-        <w:ind w:left="6300" w:hanging="360"/>
-      </w:pPr>
-      <w:rPr>
-        <w:rFonts w:ascii="Courier New" w:hAnsi="Courier New" w:cs="Courier New" w:hint="default"/>
-      </w:rPr>
-    </w:lvl>
-    <w:lvl w:ilvl="8" w:tplc="FFFFFFFF" w:tentative="1">
-      <w:start w:val="1"/>
-      <w:numFmt w:val="bullet"/>
-      <w:lvlText w:val=""/>
-      <w:lvlJc w:val="left"/>
-      <w:pPr>
-        <w:ind w:left="7020" w:hanging="360"/>
-      </w:pPr>
-      <w:rPr>
-        <w:rFonts w:ascii="Wingdings" w:hAnsi="Wingdings" w:hint="default"/>
-      </w:rPr>
-    </w:lvl>
-  </w:abstractNum>
-  <w:abstractNum w:abstractNumId="21" w15:restartNumberingAfterBreak="0">
-    <w:nsid w:val="7D126263"/>
-    <w:multiLevelType w:val="hybridMultilevel"/>
-    <w:tmpl w:val="BE984D8C"/>
-    <w:lvl w:ilvl="0" w:tplc="20000001">
-      <w:start w:val="1"/>
-      <w:numFmt w:val="bullet"/>
-      <w:lvlText w:val=""/>
-      <w:lvlJc w:val="left"/>
-      <w:pPr>
-        <w:ind w:left="900" w:hanging="360"/>
-      </w:pPr>
-      <w:rPr>
-        <w:rFonts w:ascii="Symbol" w:hAnsi="Symbol" w:hint="default"/>
-      </w:rPr>
-    </w:lvl>
-    <w:lvl w:ilvl="1" w:tplc="FFFFFFFF">
-      <w:numFmt w:val="decimal"/>
-      <w:lvlText w:val=""/>
-      <w:lvlJc w:val="left"/>
-    </w:lvl>
-    <w:lvl w:ilvl="2" w:tplc="FFFFFFFF">
-      <w:numFmt w:val="decimal"/>
-      <w:lvlText w:val=""/>
-      <w:lvlJc w:val="left"/>
-    </w:lvl>
-    <w:lvl w:ilvl="3" w:tplc="FFFFFFFF">
-      <w:numFmt w:val="decimal"/>
-      <w:lvlText w:val=""/>
-      <w:lvlJc w:val="left"/>
-    </w:lvl>
-    <w:lvl w:ilvl="4" w:tplc="FFFFFFFF">
-      <w:numFmt w:val="decimal"/>
-      <w:lvlText w:val=""/>
-      <w:lvlJc w:val="left"/>
-    </w:lvl>
-    <w:lvl w:ilvl="5" w:tplc="FFFFFFFF">
-      <w:numFmt w:val="decimal"/>
-      <w:lvlText w:val=""/>
-      <w:lvlJc w:val="left"/>
-    </w:lvl>
-    <w:lvl w:ilvl="6" w:tplc="FFFFFFFF">
-      <w:numFmt w:val="decimal"/>
-      <w:lvlText w:val=""/>
-      <w:lvlJc w:val="left"/>
-    </w:lvl>
-    <w:lvl w:ilvl="7" w:tplc="FFFFFFFF">
-      <w:numFmt w:val="decimal"/>
-      <w:lvlText w:val=""/>
-      <w:lvlJc w:val="left"/>
-    </w:lvl>
-    <w:lvl w:ilvl="8" w:tplc="FFFFFFFF">
-      <w:numFmt w:val="decimal"/>
-      <w:lvlText w:val=""/>
-      <w:lvlJc w:val="left"/>
-    </w:lvl>
-  </w:abstractNum>
-  <w:num w:numId="1" w16cid:durableId="133984715">
-    <w:abstractNumId w:val="8"/>
+  <w:num w:numId="1" w16cid:durableId="660739787">
+    <w:abstractNumId w:val="3"/>
     <w:lvlOverride w:ilvl="0">
       <w:startOverride w:val="1"/>
     </w:lvlOverride>
   </w:num>
-  <w:num w:numId="2" w16cid:durableId="1452238294">
-    <w:abstractNumId w:val="17"/>
+  <w:num w:numId="2" w16cid:durableId="1996372564">
+    <w:abstractNumId w:val="0"/>
     <w:lvlOverride w:ilvl="0">
       <w:startOverride w:val="1"/>
     </w:lvlOverride>
   </w:num>
-  <w:num w:numId="3" w16cid:durableId="1990551891">
-    <w:abstractNumId w:val="17"/>
-  </w:num>
-  <w:num w:numId="4" w16cid:durableId="105320327">
-    <w:abstractNumId w:val="13"/>
-  </w:num>
-  <w:num w:numId="5" w16cid:durableId="942569366">
-    <w:abstractNumId w:val="6"/>
-  </w:num>
-  <w:num w:numId="6" w16cid:durableId="2032103087">
-    <w:abstractNumId w:val="9"/>
-  </w:num>
-  <w:num w:numId="7" w16cid:durableId="345180452">
-    <w:abstractNumId w:val="11"/>
-  </w:num>
-  <w:num w:numId="8" w16cid:durableId="641272194">
-    <w:abstractNumId w:val="18"/>
-  </w:num>
-  <w:num w:numId="9" w16cid:durableId="373114948">
-    <w:abstractNumId w:val="12"/>
-  </w:num>
-  <w:num w:numId="10" w16cid:durableId="1917593866">
-    <w:abstractNumId w:val="15"/>
-  </w:num>
-  <w:num w:numId="11" w16cid:durableId="1299651231">
-    <w:abstractNumId w:val="16"/>
-  </w:num>
-  <w:num w:numId="12" w16cid:durableId="126440082">
-    <w:abstractNumId w:val="7"/>
-  </w:num>
-  <w:num w:numId="13" w16cid:durableId="1125081283">
-    <w:abstractNumId w:val="21"/>
-  </w:num>
-  <w:num w:numId="14" w16cid:durableId="728963870">
-    <w:abstractNumId w:val="3"/>
-  </w:num>
-  <w:num w:numId="15" w16cid:durableId="1485467018">
-    <w:abstractNumId w:val="20"/>
-  </w:num>
-  <w:num w:numId="16" w16cid:durableId="1121919448">
-    <w:abstractNumId w:val="19"/>
-  </w:num>
-  <w:num w:numId="17" w16cid:durableId="991522612">
-    <w:abstractNumId w:val="4"/>
-  </w:num>
-  <w:num w:numId="18" w16cid:durableId="353190380">
+  <w:num w:numId="3" w16cid:durableId="84695717">
     <w:abstractNumId w:val="0"/>
   </w:num>
-  <w:num w:numId="19" w16cid:durableId="280456162">
+  <w:num w:numId="4" w16cid:durableId="8413917">
     <w:abstractNumId w:val="1"/>
-  </w:num>
-  <w:num w:numId="20" w16cid:durableId="1043365391">
-    <w:abstractNumId w:val="10"/>
-  </w:num>
-  <w:num w:numId="21" w16cid:durableId="1767849757">
-    <w:abstractNumId w:val="14"/>
-  </w:num>
-  <w:num w:numId="22" w16cid:durableId="1769348701">
-    <w:abstractNumId w:val="2"/>
-  </w:num>
-  <w:num w:numId="23" w16cid:durableId="1818379222">
-    <w:abstractNumId w:val="5"/>
   </w:num>
 </w:numbering>
 </file>
@@ -13136,7 +11631,7 @@
 <file path=word\settings.xml><?xml version="1.0" encoding="utf-8"?>
 <w:settings xmlns:mc="http://schemas.openxmlformats.org/markup-compatibility/2006" xmlns:o="urn:schemas-microsoft-com:office:office" xmlns:r="http://schemas.openxmlformats.org/officeDocument/2006/relationships" xmlns:m="http://schemas.openxmlformats.org/officeDocument/2006/math" xmlns:v="urn:schemas-microsoft-com:vml" xmlns:w10="urn:schemas-microsoft-com:office:word" xmlns:w="http://schemas.openxmlformats.org/wordprocessingml/2006/main" xmlns:w14="http://schemas.microsoft.com/office/word/2010/wordml" xmlns:w15="http://schemas.microsoft.com/office/word/2012/wordml" xmlns:w16cex="http://schemas.microsoft.com/office/word/2018/wordml/cex" xmlns:w16cid="http://schemas.microsoft.com/office/word/2016/wordml/cid" xmlns:w16="http://schemas.microsoft.com/office/word/2018/wordml" xmlns:w16du="http://schemas.microsoft.com/office/word/2023/wordml/word16du" xmlns:w16sdtdh="http://schemas.microsoft.com/office/word/2020/wordml/sdtdatahash" xmlns:w16sdtfl="http://schemas.microsoft.com/office/word/2024/wordml/sdtformatlock" xmlns:w16se="http://schemas.microsoft.com/office/word/2015/wordml/symex" xmlns:sl="http://schemas.openxmlformats.org/schemaLibrary/2006/main" mc:Ignorable="w14 w15 w16se w16cid w16 w16cex w16sdtdh w16sdtfl w16du">
   <w:zoom w:percent="120"/>
-  <w:displayBackgroundShape/>
+  <w:proofState w:spelling="clean" w:grammar="clean"/>
   <w:defaultTabStop w:val="720"/>
   <w:characterSpacingControl w:val="doNotCompress"/>
   <w:footnotePr>
@@ -13156,89 +11651,23 @@
     <w:compatSetting w:name="useWord2013TrackBottomHyphenation" w:uri="http://schemas.microsoft.com/office/word" w:val="1"/>
   </w:compat>
   <w:rsids>
-    <w:rsidRoot w:val="00C63FEC"/>
-    <w:rsid w:val="00002F0A"/>
-    <w:rsid w:val="0007721E"/>
-    <w:rsid w:val="000C3FBC"/>
-    <w:rsid w:val="000F7B87"/>
-    <w:rsid w:val="00101D46"/>
-    <w:rsid w:val="001128A3"/>
-    <w:rsid w:val="001136C8"/>
-    <w:rsid w:val="0012737A"/>
-    <w:rsid w:val="00197A14"/>
-    <w:rsid w:val="001C041D"/>
-    <w:rsid w:val="001C2E2D"/>
-    <w:rsid w:val="001C3137"/>
-    <w:rsid w:val="001E38E4"/>
-    <w:rsid w:val="0025172A"/>
-    <w:rsid w:val="00276CB2"/>
-    <w:rsid w:val="002A3FFB"/>
-    <w:rsid w:val="002B047A"/>
-    <w:rsid w:val="002B098C"/>
-    <w:rsid w:val="002B54DA"/>
-    <w:rsid w:val="003928AC"/>
-    <w:rsid w:val="003E4AF1"/>
-    <w:rsid w:val="00426D1C"/>
-    <w:rsid w:val="004701A8"/>
-    <w:rsid w:val="0048427D"/>
-    <w:rsid w:val="004B37BE"/>
-    <w:rsid w:val="004E522A"/>
-    <w:rsid w:val="004F3760"/>
-    <w:rsid w:val="00507A4C"/>
-    <w:rsid w:val="00524EF2"/>
-    <w:rsid w:val="00524FD5"/>
-    <w:rsid w:val="0053222F"/>
-    <w:rsid w:val="005375A0"/>
-    <w:rsid w:val="00542418"/>
-    <w:rsid w:val="005476C7"/>
-    <w:rsid w:val="00572EAB"/>
-    <w:rsid w:val="00583941"/>
-    <w:rsid w:val="00590D28"/>
-    <w:rsid w:val="006D1B22"/>
-    <w:rsid w:val="006D72DD"/>
-    <w:rsid w:val="00707515"/>
-    <w:rsid w:val="0078225D"/>
-    <w:rsid w:val="00791B4D"/>
-    <w:rsid w:val="00847805"/>
-    <w:rsid w:val="00851B77"/>
-    <w:rsid w:val="00873D13"/>
-    <w:rsid w:val="008A08E2"/>
-    <w:rsid w:val="008B363B"/>
-    <w:rsid w:val="009220C5"/>
-    <w:rsid w:val="009343CF"/>
-    <w:rsid w:val="00953006"/>
-    <w:rsid w:val="009A2BF2"/>
-    <w:rsid w:val="009B5DB2"/>
-    <w:rsid w:val="00A314A7"/>
-    <w:rsid w:val="00A862FD"/>
-    <w:rsid w:val="00AD0D62"/>
-    <w:rsid w:val="00B16B66"/>
-    <w:rsid w:val="00B77CFA"/>
-    <w:rsid w:val="00B901B7"/>
-    <w:rsid w:val="00B90606"/>
-    <w:rsid w:val="00BA1E68"/>
-    <w:rsid w:val="00BB30C0"/>
-    <w:rsid w:val="00BC02B1"/>
-    <w:rsid w:val="00BD2405"/>
-    <w:rsid w:val="00BD2AAD"/>
-    <w:rsid w:val="00C63FEC"/>
-    <w:rsid w:val="00CC644F"/>
-    <w:rsid w:val="00CF498E"/>
-    <w:rsid w:val="00D732DE"/>
-    <w:rsid w:val="00DC616A"/>
-    <w:rsid w:val="00E30149"/>
-    <w:rsid w:val="00E343CF"/>
-    <w:rsid w:val="00E85E15"/>
-    <w:rsid w:val="00E87640"/>
-    <w:rsid w:val="00EC52E1"/>
-    <w:rsid w:val="00EE60CD"/>
-    <w:rsid w:val="00F04A7F"/>
-    <w:rsid w:val="00F112FE"/>
-    <w:rsid w:val="00F656AB"/>
-    <w:rsid w:val="00F938C0"/>
-    <w:rsid w:val="00FA01B9"/>
-    <w:rsid w:val="00FB7FD3"/>
-    <w:rsid w:val="00FF3720"/>
+    <w:rsidRoot w:val="001E3990"/>
+    <w:rsid w:val="00015E63"/>
+    <w:rsid w:val="000E28B4"/>
+    <w:rsid w:val="00173A35"/>
+    <w:rsid w:val="001E3990"/>
+    <w:rsid w:val="00207C57"/>
+    <w:rsid w:val="00225B97"/>
+    <w:rsid w:val="004A5200"/>
+    <w:rsid w:val="00632642"/>
+    <w:rsid w:val="006569A2"/>
+    <w:rsid w:val="00864B86"/>
+    <w:rsid w:val="00941152"/>
+    <w:rsid w:val="00AC37EB"/>
+    <w:rsid w:val="00C92693"/>
+    <w:rsid w:val="00CB0D92"/>
+    <w:rsid w:val="00DA008F"/>
+    <w:rsid w:val="00E0611C"/>
   </w:rsids>
   <m:mathPr>
     <m:mathFont m:val="Cambria Math"/>
@@ -13263,8 +11692,8 @@
   </w:shapeDefaults>
   <w:decimalSymbol w:val="."/>
   <w:listSeparator w:val=","/>
-  <w14:docId w14:val="62BB77C2"/>
-  <w15:docId w15:val="{7CE0A31E-07C8-4A6D-9F8A-613535CE1383}"/>
+  <w14:docId w14:val="0BC57C45"/>
+  <w15:docId w15:val="{E76CDE87-757B-4098-A974-3C4AEA4C2B0A}"/>
 </w:settings>
 </file>
 
@@ -13274,9 +11703,9 @@
     <w:rPrDefault>
       <w:rPr>
         <w:rFonts w:ascii="Arial" w:eastAsia="Arial" w:hAnsi="Arial" w:cs="Arial"/>
-        <w:color w:val="333333"/>
-        <w:sz w:val="18"/>
-        <w:szCs w:val="18"/>
+        <w:color w:val="303030"/>
+        <w:sz w:val="22"/>
+        <w:szCs w:val="22"/>
         <w:lang w:val="en-NA" w:eastAsia="en-NA" w:bidi="ar-SA"/>
       </w:rPr>
     </w:rPrDefault>
@@ -13669,38 +12098,39 @@
     <w:uiPriority w:val="9"/>
     <w:qFormat/>
     <w:pPr>
-      <w:spacing w:after="160"/>
+      <w:spacing w:before="400" w:after="200"/>
       <w:outlineLvl w:val="0"/>
     </w:pPr>
     <w:rPr>
       <w:b/>
       <w:bCs/>
-      <w:color w:val="111111"/>
-      <w:sz w:val="32"/>
-      <w:szCs w:val="32"/>
+      <w:color w:val="30B0B0"/>
+      <w:sz w:val="34"/>
+      <w:szCs w:val="34"/>
     </w:rPr>
   </w:style>
   <w:style w:type="paragraph" w:styleId="Heading2">
     <w:name w:val="heading 2"/>
-    <w:link w:val="Heading2Char"/>
     <w:uiPriority w:val="9"/>
+    <w:semiHidden/>
     <w:unhideWhenUsed/>
     <w:qFormat/>
     <w:pPr>
-      <w:spacing w:before="240" w:after="120"/>
+      <w:spacing w:before="280" w:after="140"/>
       <w:outlineLvl w:val="1"/>
     </w:pPr>
     <w:rPr>
       <w:b/>
       <w:bCs/>
-      <w:color w:val="111111"/>
-      <w:sz w:val="24"/>
-      <w:szCs w:val="24"/>
+      <w:color w:val="307070"/>
+      <w:sz w:val="27"/>
+      <w:szCs w:val="27"/>
     </w:rPr>
   </w:style>
   <w:style w:type="paragraph" w:styleId="Heading3">
     <w:name w:val="heading 3"/>
     <w:uiPriority w:val="9"/>
+    <w:semiHidden/>
     <w:unhideWhenUsed/>
     <w:qFormat/>
     <w:pPr>
@@ -13872,13 +12302,48 @@
       <w:szCs w:val="20"/>
     </w:rPr>
   </w:style>
+  <w:style w:type="paragraph" w:styleId="TOCHeading">
+    <w:name w:val="TOC Heading"/>
+    <w:basedOn w:val="Heading1"/>
+    <w:next w:val="Normal"/>
+    <w:uiPriority w:val="39"/>
+    <w:unhideWhenUsed/>
+    <w:qFormat/>
+    <w:rsid w:val="00173A35"/>
+    <w:pPr>
+      <w:keepNext/>
+      <w:keepLines/>
+      <w:spacing w:before="240" w:after="0" w:line="259" w:lineRule="auto"/>
+      <w:outlineLvl w:val="9"/>
+    </w:pPr>
+    <w:rPr>
+      <w:rFonts w:asciiTheme="majorHAnsi" w:eastAsiaTheme="majorEastAsia" w:hAnsiTheme="majorHAnsi" w:cstheme="majorBidi"/>
+      <w:b w:val="0"/>
+      <w:bCs w:val="0"/>
+      <w:color w:val="0F4761" w:themeColor="accent1" w:themeShade="BF"/>
+      <w:sz w:val="32"/>
+      <w:szCs w:val="32"/>
+    </w:rPr>
+  </w:style>
+  <w:style w:type="paragraph" w:styleId="TOC1">
+    <w:name w:val="toc 1"/>
+    <w:basedOn w:val="Normal"/>
+    <w:next w:val="Normal"/>
+    <w:autoRedefine/>
+    <w:uiPriority w:val="39"/>
+    <w:unhideWhenUsed/>
+    <w:rsid w:val="00173A35"/>
+    <w:pPr>
+      <w:spacing w:after="100"/>
+    </w:pPr>
+  </w:style>
   <w:style w:type="paragraph" w:styleId="Header">
     <w:name w:val="header"/>
     <w:basedOn w:val="Normal"/>
     <w:link w:val="HeaderChar"/>
     <w:uiPriority w:val="99"/>
     <w:unhideWhenUsed/>
-    <w:rsid w:val="00BD2AAD"/>
+    <w:rsid w:val="00E0611C"/>
     <w:pPr>
       <w:tabs>
         <w:tab w:val="center" w:pos="4513"/>
@@ -13891,7 +12356,7 @@
     <w:basedOn w:val="DefaultParagraphFont"/>
     <w:link w:val="Header"/>
     <w:uiPriority w:val="99"/>
-    <w:rsid w:val="00BD2AAD"/>
+    <w:rsid w:val="00E0611C"/>
   </w:style>
   <w:style w:type="paragraph" w:styleId="Footer">
     <w:name w:val="footer"/>
@@ -13899,7 +12364,7 @@
     <w:link w:val="FooterChar"/>
     <w:uiPriority w:val="99"/>
     <w:unhideWhenUsed/>
-    <w:rsid w:val="00BD2AAD"/>
+    <w:rsid w:val="00E0611C"/>
     <w:pPr>
       <w:tabs>
         <w:tab w:val="center" w:pos="4513"/>
@@ -13912,122 +12377,7 @@
     <w:basedOn w:val="DefaultParagraphFont"/>
     <w:link w:val="Footer"/>
     <w:uiPriority w:val="99"/>
-    <w:rsid w:val="00BD2AAD"/>
-  </w:style>
-  <w:style w:type="character" w:customStyle="1" w:styleId="Heading2Char">
-    <w:name w:val="Heading 2 Char"/>
-    <w:basedOn w:val="DefaultParagraphFont"/>
-    <w:link w:val="Heading2"/>
-    <w:uiPriority w:val="9"/>
-    <w:rsid w:val="00A314A7"/>
-    <w:rPr>
-      <w:b/>
-      <w:bCs/>
-      <w:color w:val="111111"/>
-      <w:sz w:val="24"/>
-      <w:szCs w:val="24"/>
-    </w:rPr>
-  </w:style>
-  <w:style w:type="paragraph" w:styleId="ListNumber">
-    <w:name w:val="List Number"/>
-    <w:basedOn w:val="Normal"/>
-    <w:uiPriority w:val="99"/>
-    <w:unhideWhenUsed/>
-    <w:rsid w:val="00B90606"/>
-    <w:pPr>
-      <w:numPr>
-        <w:numId w:val="18"/>
-      </w:numPr>
-      <w:contextualSpacing/>
-    </w:pPr>
-  </w:style>
-  <w:style w:type="paragraph" w:styleId="ListBullet">
-    <w:name w:val="List Bullet"/>
-    <w:basedOn w:val="Normal"/>
-    <w:uiPriority w:val="99"/>
-    <w:unhideWhenUsed/>
-    <w:rsid w:val="008A08E2"/>
-    <w:pPr>
-      <w:numPr>
-        <w:numId w:val="19"/>
-      </w:numPr>
-      <w:contextualSpacing/>
-    </w:pPr>
-  </w:style>
-  <w:style w:type="table" w:styleId="TableGrid">
-    <w:name w:val="Table Grid"/>
-    <w:basedOn w:val="TableNormal"/>
-    <w:uiPriority w:val="39"/>
-    <w:rsid w:val="009343CF"/>
-    <w:tblPr>
-      <w:tblBorders>
-        <w:top w:val="single" w:sz="4" w:space="0" w:color="auto"/>
-        <w:left w:val="single" w:sz="4" w:space="0" w:color="auto"/>
-        <w:bottom w:val="single" w:sz="4" w:space="0" w:color="auto"/>
-        <w:right w:val="single" w:sz="4" w:space="0" w:color="auto"/>
-        <w:insideH w:val="single" w:sz="4" w:space="0" w:color="auto"/>
-        <w:insideV w:val="single" w:sz="4" w:space="0" w:color="auto"/>
-      </w:tblBorders>
-    </w:tblPr>
-  </w:style>
-  <w:style w:type="paragraph" w:styleId="TOCHeading">
-    <w:name w:val="TOC Heading"/>
-    <w:basedOn w:val="Heading1"/>
-    <w:next w:val="Normal"/>
-    <w:uiPriority w:val="39"/>
-    <w:unhideWhenUsed/>
-    <w:qFormat/>
-    <w:rsid w:val="00707515"/>
-    <w:pPr>
-      <w:keepNext/>
-      <w:keepLines/>
-      <w:spacing w:before="240" w:after="0" w:line="259" w:lineRule="auto"/>
-      <w:outlineLvl w:val="9"/>
-    </w:pPr>
-    <w:rPr>
-      <w:rFonts w:asciiTheme="majorHAnsi" w:eastAsiaTheme="majorEastAsia" w:hAnsiTheme="majorHAnsi" w:cstheme="majorBidi"/>
-      <w:b w:val="0"/>
-      <w:bCs w:val="0"/>
-      <w:color w:val="0F4761" w:themeColor="accent1" w:themeShade="BF"/>
-    </w:rPr>
-  </w:style>
-  <w:style w:type="paragraph" w:styleId="TOC1">
-    <w:name w:val="toc 1"/>
-    <w:basedOn w:val="Normal"/>
-    <w:next w:val="Normal"/>
-    <w:autoRedefine/>
-    <w:uiPriority w:val="39"/>
-    <w:unhideWhenUsed/>
-    <w:rsid w:val="00707515"/>
-    <w:pPr>
-      <w:spacing w:after="100"/>
-    </w:pPr>
-  </w:style>
-  <w:style w:type="paragraph" w:styleId="TOC2">
-    <w:name w:val="toc 2"/>
-    <w:basedOn w:val="Normal"/>
-    <w:next w:val="Normal"/>
-    <w:autoRedefine/>
-    <w:uiPriority w:val="39"/>
-    <w:unhideWhenUsed/>
-    <w:rsid w:val="00707515"/>
-    <w:pPr>
-      <w:spacing w:after="100"/>
-      <w:ind w:left="180"/>
-    </w:pPr>
-  </w:style>
-  <w:style w:type="paragraph" w:styleId="TOC3">
-    <w:name w:val="toc 3"/>
-    <w:basedOn w:val="Normal"/>
-    <w:next w:val="Normal"/>
-    <w:autoRedefine/>
-    <w:uiPriority w:val="39"/>
-    <w:unhideWhenUsed/>
-    <w:rsid w:val="00276CB2"/>
-    <w:pPr>
-      <w:spacing w:after="100"/>
-      <w:ind w:left="360"/>
-    </w:pPr>
+    <w:rsid w:val="00E0611C"/>
   </w:style>
 </w:styles>
 </file>
@@ -14349,26 +12699,4 @@
 
 <file path=word\webSettings.xml><?xml version="1.0" encoding="utf-8"?>
 <w:webSettings xmlns:mc="http://schemas.openxmlformats.org/markup-compatibility/2006" xmlns:r="http://schemas.openxmlformats.org/officeDocument/2006/relationships" xmlns:w="http://schemas.openxmlformats.org/wordprocessingml/2006/main" xmlns:w14="http://schemas.microsoft.com/office/word/2010/wordml" xmlns:w15="http://schemas.microsoft.com/office/word/2012/wordml" xmlns:w16cex="http://schemas.microsoft.com/office/word/2018/wordml/cex" xmlns:w16cid="http://schemas.microsoft.com/office/word/2016/wordml/cid" xmlns:w16="http://schemas.microsoft.com/office/word/2018/wordml" xmlns:w16du="http://schemas.microsoft.com/office/word/2023/wordml/word16du" xmlns:w16sdtdh="http://schemas.microsoft.com/office/word/2020/wordml/sdtdatahash" xmlns:w16sdtfl="http://schemas.microsoft.com/office/word/2024/wordml/sdtformatlock" xmlns:w16se="http://schemas.microsoft.com/office/word/2015/wordml/symex" mc:Ignorable="w14 w15 w16se w16cid w16 w16cex w16sdtdh w16sdtfl w16du"/>
-</file>
-
-<file path=word\webextensions\taskpanes.xml><?xml version="1.0" encoding="utf-8"?>
-<wetp:taskpanes xmlns:wetp="http://schemas.microsoft.com/office/webextensions/taskpanes/2010/11">
-  <wetp:taskpane dockstate="right" visibility="0" width="615" row="2">
-    <wetp:webextensionref xmlns:r="http://schemas.openxmlformats.org/officeDocument/2006/relationships" r:id="rId1"/>
-  </wetp:taskpane>
-</wetp:taskpanes>
-</file>
-
-<file path=word\webextensions\webextension1.xml><?xml version="1.0" encoding="utf-8"?>
-<we:webextension xmlns:we="http://schemas.microsoft.com/office/webextensions/webextension/2010/11" id="{3B4370F7-DA7C-4CC4-AF53-E1E78F35E9F5}">
-  <we:reference id="wa200010453" version="1.0.0.1" store="en-001" storeType="OMEX"/>
-  <we:alternateReferences>
-    <we:reference id="WA200010453" version="1.0.0.1" store="" storeType="OMEX"/>
-  </we:alternateReferences>
-  <we:properties>
-    <we:property name="claude.fileId" value="&quot;7ae53f95-2471-4e5d-8728-0451957bd3dd&quot;"/>
-  </we:properties>
-  <we:bindings/>
-  <we:snapshot xmlns:r="http://schemas.openxmlformats.org/officeDocument/2006/relationships"/>
-</we:webextension>
 </file>
</xml_diff>